<commit_message>
exp-1 added github link in the doc
</commit_message>
<xml_diff>
--- a/Exp1/Experiment-01.docx
+++ b/Exp1/Experiment-01.docx
@@ -4,7 +4,7 @@
   <w:body>
     <w:p>
       <w:pPr>
-        <w:pStyle w:val="1045"/>
+        <w:pStyle w:val="1055"/>
         <w:pBdr/>
         <w:spacing w:before="8"/>
         <w:ind w:left="0"/>
@@ -113,7 +113,7 @@
     </w:p>
     <w:p>
       <w:pPr>
-        <w:pStyle w:val="1046"/>
+        <w:pStyle w:val="1056"/>
         <w:pBdr/>
         <w:spacing w:before="257"/>
         <w:ind/>
@@ -180,7 +180,7 @@
     </w:p>
     <w:p>
       <w:pPr>
-        <w:pStyle w:val="1047"/>
+        <w:pStyle w:val="1057"/>
         <w:pBdr/>
         <w:spacing w:before="244"/>
         <w:ind/>
@@ -196,7 +196,7 @@
     </w:p>
     <w:p>
       <w:pPr>
-        <w:pStyle w:val="1045"/>
+        <w:pStyle w:val="1055"/>
         <w:pBdr/>
         <w:spacing w:before="41"/>
         <w:ind/>
@@ -215,7 +215,7 @@
     </w:p>
     <w:p>
       <w:pPr>
-        <w:pStyle w:val="1045"/>
+        <w:pStyle w:val="1055"/>
         <w:pBdr/>
         <w:spacing w:before="43"/>
         <w:ind/>
@@ -258,7 +258,7 @@
     </w:p>
     <w:p>
       <w:pPr>
-        <w:pStyle w:val="1045"/>
+        <w:pStyle w:val="1055"/>
         <w:pBdr/>
         <w:spacing w:before="82"/>
         <w:ind w:left="0"/>
@@ -269,7 +269,7 @@
     </w:p>
     <w:p>
       <w:pPr>
-        <w:pStyle w:val="1045"/>
+        <w:pStyle w:val="1055"/>
         <w:pBdr/>
         <w:spacing w:line="276" w:lineRule="auto"/>
         <w:ind w:right="7744" w:hanging="240" w:left="600"/>
@@ -300,7 +300,7 @@
     </w:p>
     <w:p>
       <w:pPr>
-        <w:pStyle w:val="1045"/>
+        <w:pStyle w:val="1055"/>
         <w:pBdr/>
         <w:spacing/>
         <w:ind w:left="600"/>
@@ -319,7 +319,7 @@
     </w:p>
     <w:p>
       <w:pPr>
-        <w:pStyle w:val="1045"/>
+        <w:pStyle w:val="1055"/>
         <w:pBdr/>
         <w:spacing w:before="82"/>
         <w:ind w:left="0"/>
@@ -330,7 +330,7 @@
     </w:p>
     <w:p>
       <w:pPr>
-        <w:pStyle w:val="1045"/>
+        <w:pStyle w:val="1055"/>
         <w:pBdr/>
         <w:spacing/>
         <w:ind/>
@@ -382,7 +382,7 @@
     </w:p>
     <w:p>
       <w:pPr>
-        <w:pStyle w:val="1045"/>
+        <w:pStyle w:val="1055"/>
         <w:pBdr/>
         <w:spacing w:before="43"/>
         <w:ind/>
@@ -419,7 +419,7 @@
     </w:p>
     <w:p>
       <w:pPr>
-        <w:pStyle w:val="1045"/>
+        <w:pStyle w:val="1055"/>
         <w:pBdr/>
         <w:spacing w:before="74" w:line="636" w:lineRule="exact"/>
         <w:ind w:right="6668"/>
@@ -459,7 +459,7 @@
     </w:p>
     <w:p>
       <w:pPr>
-        <w:pStyle w:val="1045"/>
+        <w:pStyle w:val="1055"/>
         <w:pBdr/>
         <w:spacing w:line="242" w:lineRule="exact"/>
         <w:ind/>
@@ -475,7 +475,7 @@
     </w:p>
     <w:p>
       <w:pPr>
-        <w:pStyle w:val="1045"/>
+        <w:pStyle w:val="1055"/>
         <w:pBdr/>
         <w:spacing w:before="40" w:line="276" w:lineRule="auto"/>
         <w:ind w:right="8453"/>
@@ -518,7 +518,7 @@
     </w:p>
     <w:p>
       <w:pPr>
-        <w:pStyle w:val="1045"/>
+        <w:pStyle w:val="1055"/>
         <w:pBdr/>
         <w:spacing w:before="1"/>
         <w:ind/>
@@ -736,7 +736,7 @@
                           </w:p>
                           <w:p>
                             <w:pPr>
-                              <w:pStyle w:val="1045"/>
+                              <w:pStyle w:val="1055"/>
                               <w:pBdr/>
                               <w:spacing/>
                               <w:ind w:right="152" w:left="145"/>
@@ -802,7 +802,7 @@
                     </w:p>
                     <w:p>
                       <w:pPr>
-                        <w:pStyle w:val="1045"/>
+                        <w:pStyle w:val="1055"/>
                         <w:pBdr/>
                         <w:spacing/>
                         <w:ind w:right="152" w:left="145"/>
@@ -833,7 +833,7 @@
     </w:p>
     <w:p>
       <w:pPr>
-        <w:pStyle w:val="1045"/>
+        <w:pStyle w:val="1055"/>
         <w:pBdr/>
         <w:spacing w:after="0"/>
         <w:ind/>
@@ -854,7 +854,7 @@
     </w:p>
     <w:p>
       <w:pPr>
-        <w:pStyle w:val="1045"/>
+        <w:pStyle w:val="1055"/>
         <w:pBdr/>
         <w:spacing w:before="9"/>
         <w:ind w:left="0"/>
@@ -880,7 +880,7 @@
     </w:p>
     <w:p>
       <w:pPr>
-        <w:pStyle w:val="1046"/>
+        <w:pStyle w:val="1056"/>
         <w:numPr>
           <w:ilvl w:val="0"/>
           <w:numId w:val="1"/>
@@ -929,7 +929,7 @@
     </w:p>
     <w:p>
       <w:pPr>
-        <w:pStyle w:val="1047"/>
+        <w:pStyle w:val="1057"/>
         <w:pBdr/>
         <w:spacing w:before="246"/>
         <w:ind/>
@@ -945,7 +945,7 @@
     </w:p>
     <w:p>
       <w:pPr>
-        <w:pStyle w:val="1045"/>
+        <w:pStyle w:val="1055"/>
         <w:pBdr/>
         <w:spacing/>
         <w:ind/>
@@ -964,7 +964,7 @@
     </w:p>
     <w:p>
       <w:pPr>
-        <w:pStyle w:val="1045"/>
+        <w:pStyle w:val="1055"/>
         <w:pBdr/>
         <w:spacing/>
         <w:ind/>
@@ -1007,7 +1007,7 @@
     </w:p>
     <w:p>
       <w:pPr>
-        <w:pStyle w:val="1045"/>
+        <w:pStyle w:val="1055"/>
         <w:pBdr/>
         <w:spacing/>
         <w:ind w:left="0"/>
@@ -1018,7 +1018,7 @@
     </w:p>
     <w:p>
       <w:pPr>
-        <w:pStyle w:val="1045"/>
+        <w:pStyle w:val="1055"/>
         <w:pBdr/>
         <w:spacing w:before="1"/>
         <w:ind w:right="7744" w:hanging="240" w:left="600"/>
@@ -1049,7 +1049,7 @@
     </w:p>
     <w:p>
       <w:pPr>
-        <w:pStyle w:val="1045"/>
+        <w:pStyle w:val="1055"/>
         <w:pBdr/>
         <w:spacing/>
         <w:ind w:right="8453" w:hanging="241" w:left="1080"/>
@@ -1107,7 +1107,7 @@
     </w:p>
     <w:p>
       <w:pPr>
-        <w:pStyle w:val="1045"/>
+        <w:pStyle w:val="1055"/>
         <w:pBdr/>
         <w:spacing/>
         <w:ind w:left="600"/>
@@ -1126,7 +1126,7 @@
     </w:p>
     <w:p>
       <w:pPr>
-        <w:pStyle w:val="1045"/>
+        <w:pStyle w:val="1055"/>
         <w:pBdr/>
         <w:spacing w:before="273"/>
         <w:ind/>
@@ -1154,7 +1154,7 @@
     </w:p>
     <w:p>
       <w:pPr>
-        <w:pStyle w:val="1045"/>
+        <w:pStyle w:val="1055"/>
         <w:pBdr/>
         <w:spacing/>
         <w:ind/>
@@ -1188,7 +1188,7 @@
     </w:p>
     <w:p>
       <w:pPr>
-        <w:pStyle w:val="1045"/>
+        <w:pStyle w:val="1055"/>
         <w:pBdr/>
         <w:spacing w:before="59" w:line="552" w:lineRule="exact"/>
         <w:ind w:right="6668"/>
@@ -1234,7 +1234,7 @@
     </w:p>
     <w:p>
       <w:pPr>
-        <w:pStyle w:val="1045"/>
+        <w:pStyle w:val="1055"/>
         <w:pBdr/>
         <w:spacing w:line="218" w:lineRule="exact"/>
         <w:ind/>
@@ -1259,7 +1259,7 @@
     </w:p>
     <w:p>
       <w:pPr>
-        <w:pStyle w:val="1045"/>
+        <w:pStyle w:val="1055"/>
         <w:pBdr/>
         <w:spacing/>
         <w:ind w:right="8453"/>
@@ -1275,7 +1275,7 @@
     </w:p>
     <w:p>
       <w:pPr>
-        <w:pStyle w:val="1045"/>
+        <w:pStyle w:val="1055"/>
         <w:pBdr/>
         <w:spacing w:before="37"/>
         <w:ind w:left="0"/>
@@ -1501,7 +1501,7 @@
                           </w:p>
                           <w:p>
                             <w:pPr>
-                              <w:pStyle w:val="1045"/>
+                              <w:pStyle w:val="1055"/>
                               <w:pBdr/>
                               <w:spacing/>
                               <w:ind w:right="152" w:left="146"/>
@@ -1567,7 +1567,7 @@
                     </w:p>
                     <w:p>
                       <w:pPr>
-                        <w:pStyle w:val="1045"/>
+                        <w:pStyle w:val="1055"/>
                         <w:pBdr/>
                         <w:spacing/>
                         <w:ind w:right="152" w:left="146"/>
@@ -1601,7 +1601,7 @@
     </w:p>
     <w:p>
       <w:pPr>
-        <w:pStyle w:val="1045"/>
+        <w:pStyle w:val="1055"/>
         <w:pBdr/>
         <w:spacing w:after="0"/>
         <w:ind/>
@@ -1635,7 +1635,7 @@
     </w:p>
     <w:p>
       <w:pPr>
-        <w:pStyle w:val="1045"/>
+        <w:pStyle w:val="1055"/>
         <w:pBdr/>
         <w:spacing w:before="51"/>
         <w:ind w:left="0"/>
@@ -1646,7 +1646,7 @@
     </w:p>
     <w:p>
       <w:pPr>
-        <w:pStyle w:val="1047"/>
+        <w:pStyle w:val="1057"/>
         <w:numPr>
           <w:ilvl w:val="0"/>
           <w:numId w:val="1"/>
@@ -1754,7 +1754,7 @@
     </w:p>
     <w:p>
       <w:pPr>
-        <w:pStyle w:val="1045"/>
+        <w:pStyle w:val="1055"/>
         <w:pBdr/>
         <w:spacing w:before="5"/>
         <w:ind w:left="0"/>
@@ -1812,7 +1812,7 @@
     </w:p>
     <w:p>
       <w:pPr>
-        <w:pStyle w:val="1045"/>
+        <w:pStyle w:val="1055"/>
         <w:pBdr/>
         <w:spacing w:line="275" w:lineRule="exact"/>
         <w:ind/>
@@ -1831,7 +1831,7 @@
     </w:p>
     <w:p>
       <w:pPr>
-        <w:pStyle w:val="1045"/>
+        <w:pStyle w:val="1055"/>
         <w:pBdr/>
         <w:spacing/>
         <w:ind/>
@@ -1874,7 +1874,7 @@
     </w:p>
     <w:p>
       <w:pPr>
-        <w:pStyle w:val="1045"/>
+        <w:pStyle w:val="1055"/>
         <w:pBdr/>
         <w:spacing/>
         <w:ind w:left="0"/>
@@ -1885,7 +1885,7 @@
     </w:p>
     <w:p>
       <w:pPr>
-        <w:pStyle w:val="1045"/>
+        <w:pStyle w:val="1055"/>
         <w:pBdr/>
         <w:spacing/>
         <w:ind/>
@@ -1910,7 +1910,7 @@
     </w:p>
     <w:p>
       <w:pPr>
-        <w:pStyle w:val="1045"/>
+        <w:pStyle w:val="1055"/>
         <w:pBdr/>
         <w:spacing/>
         <w:ind w:right="7744" w:left="600"/>
@@ -1941,7 +1941,7 @@
     </w:p>
     <w:p>
       <w:pPr>
-        <w:pStyle w:val="1045"/>
+        <w:pStyle w:val="1055"/>
         <w:pBdr/>
         <w:spacing/>
         <w:ind w:left="600"/>
@@ -1960,7 +1960,7 @@
     </w:p>
     <w:p>
       <w:pPr>
-        <w:pStyle w:val="1045"/>
+        <w:pStyle w:val="1055"/>
         <w:pBdr/>
         <w:spacing/>
         <w:ind w:left="0"/>
@@ -1971,7 +1971,7 @@
     </w:p>
     <w:p>
       <w:pPr>
-        <w:pStyle w:val="1045"/>
+        <w:pStyle w:val="1055"/>
         <w:pBdr/>
         <w:spacing/>
         <w:ind/>
@@ -1996,7 +1996,7 @@
     </w:p>
     <w:p>
       <w:pPr>
-        <w:pStyle w:val="1045"/>
+        <w:pStyle w:val="1055"/>
         <w:pBdr/>
         <w:spacing/>
         <w:ind w:right="8098" w:left="600"/>
@@ -2027,7 +2027,7 @@
     </w:p>
     <w:p>
       <w:pPr>
-        <w:pStyle w:val="1045"/>
+        <w:pStyle w:val="1055"/>
         <w:pBdr/>
         <w:spacing/>
         <w:ind w:left="0"/>
@@ -2038,7 +2038,7 @@
     </w:p>
     <w:p>
       <w:pPr>
-        <w:pStyle w:val="1045"/>
+        <w:pStyle w:val="1055"/>
         <w:pBdr/>
         <w:spacing/>
         <w:ind w:right="6668"/>
@@ -2069,7 +2069,7 @@
     </w:p>
     <w:p>
       <w:pPr>
-        <w:pStyle w:val="1045"/>
+        <w:pStyle w:val="1055"/>
         <w:pBdr/>
         <w:spacing w:before="1"/>
         <w:ind w:left="0"/>
@@ -2080,7 +2080,7 @@
     </w:p>
     <w:p>
       <w:pPr>
-        <w:pStyle w:val="1045"/>
+        <w:pStyle w:val="1055"/>
         <w:pBdr/>
         <w:spacing/>
         <w:ind/>
@@ -2114,7 +2114,7 @@
     </w:p>
     <w:p>
       <w:pPr>
-        <w:pStyle w:val="1045"/>
+        <w:pStyle w:val="1055"/>
         <w:pBdr/>
         <w:spacing/>
         <w:ind/>
@@ -2142,7 +2142,7 @@
     </w:p>
     <w:p>
       <w:pPr>
-        <w:pStyle w:val="1045"/>
+        <w:pStyle w:val="1055"/>
         <w:pBdr/>
         <w:spacing/>
         <w:ind w:left="0"/>
@@ -2153,7 +2153,7 @@
     </w:p>
     <w:p>
       <w:pPr>
-        <w:pStyle w:val="1045"/>
+        <w:pStyle w:val="1055"/>
         <w:pBdr/>
         <w:spacing/>
         <w:ind/>
@@ -2172,7 +2172,7 @@
     </w:p>
     <w:p>
       <w:pPr>
-        <w:pStyle w:val="1045"/>
+        <w:pStyle w:val="1055"/>
         <w:pBdr/>
         <w:spacing/>
         <w:ind/>
@@ -2191,7 +2191,7 @@
     </w:p>
     <w:p>
       <w:pPr>
-        <w:pStyle w:val="1045"/>
+        <w:pStyle w:val="1055"/>
         <w:pBdr/>
         <w:spacing/>
         <w:ind w:right="7943"/>
@@ -2237,7 +2237,7 @@
     </w:p>
     <w:p>
       <w:pPr>
-        <w:pStyle w:val="1045"/>
+        <w:pStyle w:val="1055"/>
         <w:pBdr/>
         <w:spacing w:before="274"/>
         <w:ind w:right="7744"/>
@@ -2292,7 +2292,7 @@
     </w:p>
     <w:p>
       <w:pPr>
-        <w:pStyle w:val="1045"/>
+        <w:pStyle w:val="1055"/>
         <w:pBdr/>
         <w:spacing/>
         <w:ind w:left="0"/>
@@ -2303,7 +2303,7 @@
     </w:p>
     <w:p>
       <w:pPr>
-        <w:pStyle w:val="1045"/>
+        <w:pStyle w:val="1055"/>
         <w:pBdr/>
         <w:spacing/>
         <w:ind w:right="9413"/>
@@ -2319,7 +2319,7 @@
     </w:p>
     <w:p>
       <w:pPr>
-        <w:pStyle w:val="1045"/>
+        <w:pStyle w:val="1055"/>
         <w:pBdr/>
         <w:spacing w:after="0"/>
         <w:ind/>
@@ -2338,7 +2338,7 @@
     </w:p>
     <w:p>
       <w:pPr>
-        <w:pStyle w:val="1045"/>
+        <w:pStyle w:val="1055"/>
         <w:pBdr/>
         <w:spacing w:after="1" w:before="112"/>
         <w:ind w:left="0"/>
@@ -2546,7 +2546,7 @@
     </w:p>
     <w:p>
       <w:pPr>
-        <w:pStyle w:val="1045"/>
+        <w:pStyle w:val="1055"/>
         <w:pBdr/>
         <w:spacing/>
         <w:ind w:right="743"/>
@@ -2562,7 +2562,7 @@
     </w:p>
     <w:p>
       <w:pPr>
-        <w:pStyle w:val="1046"/>
+        <w:pStyle w:val="1056"/>
         <w:numPr>
           <w:ilvl w:val="0"/>
           <w:numId w:val="1"/>
@@ -2669,7 +2669,7 @@
     </w:p>
     <w:p>
       <w:pPr>
-        <w:pStyle w:val="1045"/>
+        <w:pStyle w:val="1055"/>
         <w:pBdr/>
         <w:spacing w:line="273" w:lineRule="exact"/>
         <w:ind/>
@@ -2688,7 +2688,7 @@
     </w:p>
     <w:p>
       <w:pPr>
-        <w:pStyle w:val="1045"/>
+        <w:pStyle w:val="1055"/>
         <w:pBdr/>
         <w:spacing/>
         <w:ind/>
@@ -2731,7 +2731,7 @@
     </w:p>
     <w:p>
       <w:pPr>
-        <w:pStyle w:val="1045"/>
+        <w:pStyle w:val="1055"/>
         <w:pBdr/>
         <w:spacing/>
         <w:ind w:left="0"/>
@@ -2742,7 +2742,7 @@
     </w:p>
     <w:p>
       <w:pPr>
-        <w:pStyle w:val="1045"/>
+        <w:pStyle w:val="1055"/>
         <w:pBdr/>
         <w:spacing/>
         <w:ind w:right="8453" w:hanging="240" w:left="600"/>
@@ -2773,7 +2773,7 @@
     </w:p>
     <w:p>
       <w:pPr>
-        <w:pStyle w:val="1045"/>
+        <w:pStyle w:val="1055"/>
         <w:pBdr/>
         <w:spacing/>
         <w:ind w:right="6668" w:left="600"/>
@@ -2858,7 +2858,7 @@
     </w:p>
     <w:p>
       <w:pPr>
-        <w:pStyle w:val="1045"/>
+        <w:pStyle w:val="1055"/>
         <w:pBdr/>
         <w:spacing/>
         <w:ind w:left="0"/>
@@ -2869,7 +2869,7 @@
     </w:p>
     <w:p>
       <w:pPr>
-        <w:pStyle w:val="1045"/>
+        <w:pStyle w:val="1055"/>
         <w:pBdr/>
         <w:spacing/>
         <w:ind w:right="8453" w:hanging="240" w:left="600"/>
@@ -2921,7 +2921,7 @@
     </w:p>
     <w:p>
       <w:pPr>
-        <w:pStyle w:val="1045"/>
+        <w:pStyle w:val="1055"/>
         <w:pBdr/>
         <w:spacing/>
         <w:ind w:right="4764" w:left="600"/>
@@ -3015,7 +3015,7 @@
     </w:p>
     <w:p>
       <w:pPr>
-        <w:pStyle w:val="1045"/>
+        <w:pStyle w:val="1055"/>
         <w:pBdr/>
         <w:spacing w:after="0"/>
         <w:ind/>
@@ -3034,7 +3034,7 @@
     </w:p>
     <w:p>
       <w:pPr>
-        <w:pStyle w:val="1045"/>
+        <w:pStyle w:val="1055"/>
         <w:pBdr/>
         <w:spacing/>
         <w:ind w:left="0"/>
@@ -3045,7 +3045,7 @@
     </w:p>
     <w:p>
       <w:pPr>
-        <w:pStyle w:val="1045"/>
+        <w:pStyle w:val="1055"/>
         <w:pBdr/>
         <w:spacing w:before="51"/>
         <w:ind w:left="0"/>
@@ -3056,7 +3056,7 @@
     </w:p>
     <w:p>
       <w:pPr>
-        <w:pStyle w:val="1045"/>
+        <w:pStyle w:val="1055"/>
         <w:pBdr/>
         <w:spacing w:before="1"/>
         <w:ind/>
@@ -3108,7 +3108,7 @@
     </w:p>
     <w:p>
       <w:pPr>
-        <w:pStyle w:val="1045"/>
+        <w:pStyle w:val="1055"/>
         <w:pBdr/>
         <w:spacing/>
         <w:ind/>
@@ -3142,7 +3142,7 @@
     </w:p>
     <w:p>
       <w:pPr>
-        <w:pStyle w:val="1045"/>
+        <w:pStyle w:val="1055"/>
         <w:pBdr/>
         <w:spacing/>
         <w:ind/>
@@ -3167,7 +3167,7 @@
     </w:p>
     <w:p>
       <w:pPr>
-        <w:pStyle w:val="1045"/>
+        <w:pStyle w:val="1055"/>
         <w:pBdr/>
         <w:spacing/>
         <w:ind w:left="0"/>
@@ -3178,7 +3178,7 @@
     </w:p>
     <w:p>
       <w:pPr>
-        <w:pStyle w:val="1045"/>
+        <w:pStyle w:val="1055"/>
         <w:pBdr/>
         <w:spacing/>
         <w:ind w:right="6668"/>
@@ -3218,7 +3218,7 @@
     </w:p>
     <w:p>
       <w:pPr>
-        <w:pStyle w:val="1045"/>
+        <w:pStyle w:val="1055"/>
         <w:pBdr/>
         <w:spacing/>
         <w:ind w:left="0"/>
@@ -3229,7 +3229,7 @@
     </w:p>
     <w:p>
       <w:pPr>
-        <w:pStyle w:val="1045"/>
+        <w:pStyle w:val="1055"/>
         <w:pBdr/>
         <w:spacing/>
         <w:ind/>
@@ -3248,7 +3248,7 @@
     </w:p>
     <w:p>
       <w:pPr>
-        <w:pStyle w:val="1045"/>
+        <w:pStyle w:val="1055"/>
         <w:pBdr/>
         <w:spacing/>
         <w:ind w:right="8466"/>
@@ -3276,7 +3276,7 @@
     </w:p>
     <w:p>
       <w:pPr>
-        <w:pStyle w:val="1045"/>
+        <w:pStyle w:val="1055"/>
         <w:pBdr/>
         <w:spacing w:before="1"/>
         <w:ind w:right="8098"/>
@@ -3313,7 +3313,7 @@
     </w:p>
     <w:p>
       <w:pPr>
-        <w:pStyle w:val="1045"/>
+        <w:pStyle w:val="1055"/>
         <w:pBdr/>
         <w:spacing w:before="276"/>
         <w:ind w:right="7744"/>
@@ -3359,7 +3359,7 @@
     </w:p>
     <w:p>
       <w:pPr>
-        <w:pStyle w:val="1045"/>
+        <w:pStyle w:val="1055"/>
         <w:pBdr/>
         <w:spacing/>
         <w:ind w:left="0"/>
@@ -3370,7 +3370,7 @@
     </w:p>
     <w:p>
       <w:pPr>
-        <w:pStyle w:val="1045"/>
+        <w:pStyle w:val="1055"/>
         <w:pBdr/>
         <w:spacing/>
         <w:ind w:right="9413"/>
@@ -3386,7 +3386,7 @@
     </w:p>
     <w:p>
       <w:pPr>
-        <w:pStyle w:val="1045"/>
+        <w:pStyle w:val="1055"/>
         <w:pBdr/>
         <w:spacing w:before="35"/>
         <w:ind w:left="0"/>
@@ -3580,7 +3580,7 @@
                         <w:txbxContent>
                           <w:p>
                             <w:pPr>
-                              <w:pStyle w:val="1045"/>
+                              <w:pStyle w:val="1055"/>
                               <w:pBdr/>
                               <w:spacing/>
                               <w:ind w:right="184" w:left="145"/>
@@ -3614,7 +3614,7 @@
                   <w:txbxContent>
                     <w:p>
                       <w:pPr>
-                        <w:pStyle w:val="1045"/>
+                        <w:pStyle w:val="1055"/>
                         <w:pBdr/>
                         <w:spacing/>
                         <w:ind w:right="184" w:left="145"/>
@@ -3648,7 +3648,7 @@
     </w:p>
     <w:p>
       <w:pPr>
-        <w:pStyle w:val="1045"/>
+        <w:pStyle w:val="1055"/>
         <w:pBdr/>
         <w:spacing w:after="0"/>
         <w:ind/>
@@ -3682,7 +3682,7 @@
     </w:p>
     <w:p>
       <w:pPr>
-        <w:pStyle w:val="1045"/>
+        <w:pStyle w:val="1055"/>
         <w:pBdr/>
         <w:spacing w:before="7"/>
         <w:ind w:left="0"/>
@@ -3708,7 +3708,7 @@
     </w:p>
     <w:p>
       <w:pPr>
-        <w:pStyle w:val="1046"/>
+        <w:pStyle w:val="1056"/>
         <w:numPr>
           <w:ilvl w:val="0"/>
           <w:numId w:val="1"/>
@@ -3803,7 +3803,7 @@
     </w:p>
     <w:p>
       <w:pPr>
-        <w:pStyle w:val="1045"/>
+        <w:pStyle w:val="1055"/>
         <w:pBdr/>
         <w:spacing w:before="274"/>
         <w:ind/>
@@ -3819,7 +3819,7 @@
     </w:p>
     <w:p>
       <w:pPr>
-        <w:pStyle w:val="1045"/>
+        <w:pStyle w:val="1055"/>
         <w:pBdr/>
         <w:spacing/>
         <w:ind/>
@@ -3838,7 +3838,7 @@
     </w:p>
     <w:p>
       <w:pPr>
-        <w:pStyle w:val="1045"/>
+        <w:pStyle w:val="1055"/>
         <w:pBdr/>
         <w:spacing w:before="1"/>
         <w:ind/>
@@ -3881,7 +3881,7 @@
     </w:p>
     <w:p>
       <w:pPr>
-        <w:pStyle w:val="1045"/>
+        <w:pStyle w:val="1055"/>
         <w:pBdr/>
         <w:spacing/>
         <w:ind w:left="0"/>
@@ -3892,7 +3892,7 @@
     </w:p>
     <w:p>
       <w:pPr>
-        <w:pStyle w:val="1045"/>
+        <w:pStyle w:val="1055"/>
         <w:pBdr/>
         <w:spacing/>
         <w:ind w:right="6668" w:hanging="240" w:left="600"/>
@@ -3950,7 +3950,7 @@
     </w:p>
     <w:p>
       <w:pPr>
-        <w:pStyle w:val="1045"/>
+        <w:pStyle w:val="1055"/>
         <w:pBdr/>
         <w:spacing/>
         <w:ind w:left="0"/>
@@ -3961,7 +3961,7 @@
     </w:p>
     <w:p>
       <w:pPr>
-        <w:pStyle w:val="1045"/>
+        <w:pStyle w:val="1055"/>
         <w:pBdr/>
         <w:spacing/>
         <w:ind/>
@@ -3998,7 +3998,7 @@
     </w:p>
     <w:p>
       <w:pPr>
-        <w:pStyle w:val="1045"/>
+        <w:pStyle w:val="1055"/>
         <w:pBdr/>
         <w:spacing/>
         <w:ind w:left="600"/>
@@ -4059,7 +4059,7 @@
     </w:p>
     <w:p>
       <w:pPr>
-        <w:pStyle w:val="1045"/>
+        <w:pStyle w:val="1055"/>
         <w:pBdr/>
         <w:spacing/>
         <w:ind w:left="0"/>
@@ -4070,7 +4070,7 @@
     </w:p>
     <w:p>
       <w:pPr>
-        <w:pStyle w:val="1045"/>
+        <w:pStyle w:val="1055"/>
         <w:pBdr/>
         <w:spacing/>
         <w:ind/>
@@ -4122,7 +4122,7 @@
     </w:p>
     <w:p>
       <w:pPr>
-        <w:pStyle w:val="1045"/>
+        <w:pStyle w:val="1055"/>
         <w:pBdr/>
         <w:spacing/>
         <w:ind/>
@@ -4156,7 +4156,7 @@
     </w:p>
     <w:p>
       <w:pPr>
-        <w:pStyle w:val="1045"/>
+        <w:pStyle w:val="1055"/>
         <w:pBdr/>
         <w:spacing/>
         <w:ind/>
@@ -4190,7 +4190,7 @@
     </w:p>
     <w:p>
       <w:pPr>
-        <w:pStyle w:val="1045"/>
+        <w:pStyle w:val="1055"/>
         <w:pBdr/>
         <w:spacing/>
         <w:ind/>
@@ -4227,7 +4227,7 @@
     </w:p>
     <w:p>
       <w:pPr>
-        <w:pStyle w:val="1045"/>
+        <w:pStyle w:val="1055"/>
         <w:pBdr/>
         <w:spacing/>
         <w:ind w:left="0"/>
@@ -4238,7 +4238,7 @@
     </w:p>
     <w:p>
       <w:pPr>
-        <w:pStyle w:val="1045"/>
+        <w:pStyle w:val="1055"/>
         <w:pBdr/>
         <w:spacing w:before="1"/>
         <w:ind w:right="4764"/>
@@ -4287,7 +4287,7 @@
     </w:p>
     <w:p>
       <w:pPr>
-        <w:pStyle w:val="1045"/>
+        <w:pStyle w:val="1055"/>
         <w:pBdr/>
         <w:spacing/>
         <w:ind w:left="0"/>
@@ -4298,7 +4298,7 @@
     </w:p>
     <w:p>
       <w:pPr>
-        <w:pStyle w:val="1045"/>
+        <w:pStyle w:val="1055"/>
         <w:pBdr/>
         <w:spacing/>
         <w:ind/>
@@ -4317,7 +4317,7 @@
     </w:p>
     <w:p>
       <w:pPr>
-        <w:pStyle w:val="1045"/>
+        <w:pStyle w:val="1055"/>
         <w:pBdr/>
         <w:spacing/>
         <w:ind/>
@@ -4336,7 +4336,7 @@
     </w:p>
     <w:p>
       <w:pPr>
-        <w:pStyle w:val="1045"/>
+        <w:pStyle w:val="1055"/>
         <w:pBdr/>
         <w:spacing/>
         <w:ind w:right="6668"/>
@@ -4373,7 +4373,7 @@
     </w:p>
     <w:p>
       <w:pPr>
-        <w:pStyle w:val="1045"/>
+        <w:pStyle w:val="1055"/>
         <w:pBdr/>
         <w:spacing/>
         <w:ind/>
@@ -4389,7 +4389,7 @@
     </w:p>
     <w:p>
       <w:pPr>
-        <w:pStyle w:val="1045"/>
+        <w:pStyle w:val="1055"/>
         <w:pBdr/>
         <w:spacing/>
         <w:ind w:left="0"/>
@@ -4400,7 +4400,7 @@
     </w:p>
     <w:p>
       <w:pPr>
-        <w:pStyle w:val="1045"/>
+        <w:pStyle w:val="1055"/>
         <w:pBdr/>
         <w:spacing/>
         <w:ind w:right="7744"/>
@@ -4446,7 +4446,7 @@
     </w:p>
     <w:p>
       <w:pPr>
-        <w:pStyle w:val="1045"/>
+        <w:pStyle w:val="1055"/>
         <w:pBdr/>
         <w:spacing/>
         <w:ind w:left="0"/>
@@ -4457,7 +4457,7 @@
     </w:p>
     <w:p>
       <w:pPr>
-        <w:pStyle w:val="1045"/>
+        <w:pStyle w:val="1055"/>
         <w:pBdr/>
         <w:spacing w:before="1"/>
         <w:ind w:right="9413"/>
@@ -4473,7 +4473,7 @@
     </w:p>
     <w:p>
       <w:pPr>
-        <w:pStyle w:val="1045"/>
+        <w:pStyle w:val="1055"/>
         <w:pBdr/>
         <w:spacing w:after="0"/>
         <w:ind/>
@@ -4492,7 +4492,7 @@
     </w:p>
     <w:p>
       <w:pPr>
-        <w:pStyle w:val="1045"/>
+        <w:pStyle w:val="1055"/>
         <w:pBdr/>
         <w:spacing w:after="1" w:before="112"/>
         <w:ind w:left="0"/>
@@ -4671,7 +4671,7 @@
     </w:p>
     <w:p>
       <w:pPr>
-        <w:pStyle w:val="1047"/>
+        <w:pStyle w:val="1057"/>
         <w:pBdr/>
         <w:spacing w:before="271"/>
         <w:ind/>
@@ -4692,10 +4692,16 @@
           <w:highlight w:val="none"/>
         </w:rPr>
       </w:r>
+      <w:r>
+        <w:rPr>
+          <w:spacing w:val="-2"/>
+          <w:highlight w:val="none"/>
+        </w:rPr>
+      </w:r>
     </w:p>
     <w:p>
       <w:pPr>
-        <w:pStyle w:val="1047"/>
+        <w:pStyle w:val="1057"/>
         <w:pBdr/>
         <w:spacing w:before="271"/>
         <w:ind/>
@@ -4730,8 +4736,6 @@
         <w:rPr>
           <w:b w:val="0"/>
           <w:bCs w:val="0"/>
-          <w:spacing w:val="-2"/>
-          <w:highlight w:val="none"/>
         </w:rPr>
       </w:r>
       <w:r>
@@ -4743,7 +4747,7 @@
     </w:p>
     <w:p>
       <w:pPr>
-        <w:pStyle w:val="1045"/>
+        <w:pStyle w:val="1055"/>
         <w:pBdr/>
         <w:spacing w:before="1"/>
         <w:ind w:left="0"/>
@@ -4754,7 +4758,7 @@
     </w:p>
     <w:p>
       <w:pPr>
-        <w:pStyle w:val="1046"/>
+        <w:pStyle w:val="1056"/>
         <w:numPr>
           <w:ilvl w:val="0"/>
           <w:numId w:val="1"/>
@@ -4849,7 +4853,7 @@
     </w:p>
     <w:p>
       <w:pPr>
-        <w:pStyle w:val="1045"/>
+        <w:pStyle w:val="1055"/>
         <w:pBdr/>
         <w:spacing w:before="44"/>
         <w:ind w:left="0"/>
@@ -4875,7 +4879,7 @@
     </w:p>
     <w:p>
       <w:pPr>
-        <w:pStyle w:val="1047"/>
+        <w:pStyle w:val="1057"/>
         <w:pBdr/>
         <w:spacing/>
         <w:ind/>
@@ -4891,7 +4895,7 @@
     </w:p>
     <w:p>
       <w:pPr>
-        <w:pStyle w:val="1045"/>
+        <w:pStyle w:val="1055"/>
         <w:pBdr/>
         <w:spacing/>
         <w:ind/>
@@ -4910,7 +4914,7 @@
     </w:p>
     <w:p>
       <w:pPr>
-        <w:pStyle w:val="1045"/>
+        <w:pStyle w:val="1055"/>
         <w:pBdr/>
         <w:spacing/>
         <w:ind/>
@@ -4953,7 +4957,7 @@
     </w:p>
     <w:p>
       <w:pPr>
-        <w:pStyle w:val="1045"/>
+        <w:pStyle w:val="1055"/>
         <w:pBdr/>
         <w:spacing w:before="1"/>
         <w:ind w:left="0"/>
@@ -4964,7 +4968,7 @@
     </w:p>
     <w:p>
       <w:pPr>
-        <w:pStyle w:val="1045"/>
+        <w:pStyle w:val="1055"/>
         <w:pBdr/>
         <w:spacing/>
         <w:ind w:right="7744" w:hanging="240" w:left="600"/>
@@ -4995,7 +4999,7 @@
     </w:p>
     <w:p>
       <w:pPr>
-        <w:pStyle w:val="1045"/>
+        <w:pStyle w:val="1055"/>
         <w:pBdr/>
         <w:spacing/>
         <w:ind w:left="0"/>
@@ -5006,7 +5010,7 @@
     </w:p>
     <w:p>
       <w:pPr>
-        <w:pStyle w:val="1045"/>
+        <w:pStyle w:val="1055"/>
         <w:pBdr/>
         <w:spacing/>
         <w:ind/>
@@ -5040,7 +5044,7 @@
     </w:p>
     <w:p>
       <w:pPr>
-        <w:pStyle w:val="1045"/>
+        <w:pStyle w:val="1055"/>
         <w:pBdr/>
         <w:spacing/>
         <w:ind w:left="600"/>
@@ -5068,7 +5072,7 @@
     </w:p>
     <w:p>
       <w:pPr>
-        <w:pStyle w:val="1045"/>
+        <w:pStyle w:val="1055"/>
         <w:pBdr/>
         <w:spacing/>
         <w:ind w:left="0"/>
@@ -5079,7 +5083,7 @@
     </w:p>
     <w:p>
       <w:pPr>
-        <w:pStyle w:val="1045"/>
+        <w:pStyle w:val="1055"/>
         <w:pBdr/>
         <w:spacing/>
         <w:ind/>
@@ -5131,7 +5135,7 @@
     </w:p>
     <w:p>
       <w:pPr>
-        <w:pStyle w:val="1045"/>
+        <w:pStyle w:val="1055"/>
         <w:pBdr/>
         <w:spacing/>
         <w:ind/>
@@ -5165,7 +5169,7 @@
     </w:p>
     <w:p>
       <w:pPr>
-        <w:pStyle w:val="1045"/>
+        <w:pStyle w:val="1055"/>
         <w:pBdr/>
         <w:spacing/>
         <w:ind/>
@@ -5217,7 +5221,7 @@
     </w:p>
     <w:p>
       <w:pPr>
-        <w:pStyle w:val="1045"/>
+        <w:pStyle w:val="1055"/>
         <w:pBdr/>
         <w:spacing/>
         <w:ind w:left="0"/>
@@ -5228,7 +5232,7 @@
     </w:p>
     <w:p>
       <w:pPr>
-        <w:pStyle w:val="1045"/>
+        <w:pStyle w:val="1055"/>
         <w:pBdr/>
         <w:spacing/>
         <w:ind w:right="4764"/>
@@ -5268,7 +5272,7 @@
     </w:p>
     <w:p>
       <w:pPr>
-        <w:pStyle w:val="1045"/>
+        <w:pStyle w:val="1055"/>
         <w:pBdr/>
         <w:spacing w:after="0"/>
         <w:ind/>
@@ -5287,7 +5291,7 @@
     </w:p>
     <w:p>
       <w:pPr>
-        <w:pStyle w:val="1045"/>
+        <w:pStyle w:val="1055"/>
         <w:pBdr/>
         <w:spacing w:before="51"/>
         <w:ind w:left="0"/>
@@ -5298,7 +5302,7 @@
     </w:p>
     <w:p>
       <w:pPr>
-        <w:pStyle w:val="1045"/>
+        <w:pStyle w:val="1055"/>
         <w:pBdr/>
         <w:spacing w:before="1"/>
         <w:ind/>
@@ -5317,7 +5321,7 @@
     </w:p>
     <w:p>
       <w:pPr>
-        <w:pStyle w:val="1045"/>
+        <w:pStyle w:val="1055"/>
         <w:pBdr/>
         <w:spacing/>
         <w:ind/>
@@ -5336,7 +5340,7 @@
     </w:p>
     <w:p>
       <w:pPr>
-        <w:pStyle w:val="1045"/>
+        <w:pStyle w:val="1055"/>
         <w:pBdr/>
         <w:spacing/>
         <w:ind w:right="7943"/>
@@ -5373,7 +5377,7 @@
     </w:p>
     <w:p>
       <w:pPr>
-        <w:pStyle w:val="1045"/>
+        <w:pStyle w:val="1055"/>
         <w:pBdr/>
         <w:spacing/>
         <w:ind w:left="0"/>
@@ -5384,7 +5388,7 @@
     </w:p>
     <w:p>
       <w:pPr>
-        <w:pStyle w:val="1045"/>
+        <w:pStyle w:val="1055"/>
         <w:pBdr/>
         <w:spacing/>
         <w:ind w:right="7744"/>
@@ -5430,7 +5434,7 @@
     </w:p>
     <w:p>
       <w:pPr>
-        <w:pStyle w:val="1045"/>
+        <w:pStyle w:val="1055"/>
         <w:pBdr/>
         <w:spacing/>
         <w:ind w:left="0"/>
@@ -5441,7 +5445,7 @@
     </w:p>
     <w:p>
       <w:pPr>
-        <w:pStyle w:val="1045"/>
+        <w:pStyle w:val="1055"/>
         <w:pBdr/>
         <w:spacing w:before="1"/>
         <w:ind w:right="9413"/>
@@ -5457,7 +5461,7 @@
     </w:p>
     <w:p>
       <w:pPr>
-        <w:pStyle w:val="1045"/>
+        <w:pStyle w:val="1055"/>
         <w:pBdr/>
         <w:spacing w:before="35"/>
         <w:ind w:left="0"/>
@@ -5620,7 +5624,7 @@
     </w:p>
     <w:p>
       <w:pPr>
-        <w:pStyle w:val="1045"/>
+        <w:pStyle w:val="1055"/>
         <w:pBdr/>
         <w:spacing w:before="21"/>
         <w:ind w:left="0"/>
@@ -5631,7 +5635,7 @@
     </w:p>
     <w:p>
       <w:pPr>
-        <w:pStyle w:val="1047"/>
+        <w:pStyle w:val="1057"/>
         <w:pBdr/>
         <w:spacing/>
         <w:ind/>
@@ -5647,7 +5651,7 @@
     </w:p>
     <w:p>
       <w:pPr>
-        <w:pStyle w:val="1045"/>
+        <w:pStyle w:val="1055"/>
         <w:pBdr/>
         <w:spacing w:after="0"/>
         <w:ind/>
@@ -5672,7 +5676,7 @@
     </w:p>
     <w:p>
       <w:pPr>
-        <w:pStyle w:val="1045"/>
+        <w:pStyle w:val="1055"/>
         <w:pBdr/>
         <w:spacing w:before="7"/>
         <w:ind w:left="0"/>
@@ -5698,7 +5702,7 @@
     </w:p>
     <w:p>
       <w:pPr>
-        <w:pStyle w:val="1046"/>
+        <w:pStyle w:val="1056"/>
         <w:numPr>
           <w:ilvl w:val="0"/>
           <w:numId w:val="1"/>
@@ -5806,7 +5810,7 @@
     </w:p>
     <w:p>
       <w:pPr>
-        <w:pStyle w:val="1045"/>
+        <w:pStyle w:val="1055"/>
         <w:pBdr/>
         <w:spacing w:before="44"/>
         <w:ind w:left="0"/>
@@ -5832,7 +5836,7 @@
     </w:p>
     <w:p>
       <w:pPr>
-        <w:pStyle w:val="1047"/>
+        <w:pStyle w:val="1057"/>
         <w:pBdr/>
         <w:spacing/>
         <w:ind/>
@@ -5848,7 +5852,7 @@
     </w:p>
     <w:p>
       <w:pPr>
-        <w:pStyle w:val="1045"/>
+        <w:pStyle w:val="1055"/>
         <w:pBdr/>
         <w:spacing/>
         <w:ind/>
@@ -5867,7 +5871,7 @@
     </w:p>
     <w:p>
       <w:pPr>
-        <w:pStyle w:val="1045"/>
+        <w:pStyle w:val="1055"/>
         <w:pBdr/>
         <w:spacing w:before="1"/>
         <w:ind/>
@@ -5910,7 +5914,7 @@
     </w:p>
     <w:p>
       <w:pPr>
-        <w:pStyle w:val="1045"/>
+        <w:pStyle w:val="1055"/>
         <w:pBdr/>
         <w:spacing w:before="276"/>
         <w:ind/>
@@ -5962,7 +5966,7 @@
     </w:p>
     <w:p>
       <w:pPr>
-        <w:pStyle w:val="1045"/>
+        <w:pStyle w:val="1055"/>
         <w:pBdr/>
         <w:spacing/>
         <w:ind w:left="600"/>
@@ -6017,7 +6021,7 @@
     </w:p>
     <w:p>
       <w:pPr>
-        <w:pStyle w:val="1045"/>
+        <w:pStyle w:val="1055"/>
         <w:pBdr/>
         <w:spacing w:before="276"/>
         <w:ind w:right="4140" w:hanging="240" w:left="600"/>
@@ -6075,7 +6079,7 @@
     </w:p>
     <w:p>
       <w:pPr>
-        <w:pStyle w:val="1045"/>
+        <w:pStyle w:val="1055"/>
         <w:pBdr/>
         <w:spacing/>
         <w:ind w:left="600"/>
@@ -6148,7 +6152,7 @@
     </w:p>
     <w:p>
       <w:pPr>
-        <w:pStyle w:val="1045"/>
+        <w:pStyle w:val="1055"/>
         <w:pBdr/>
         <w:spacing/>
         <w:ind w:left="0"/>
@@ -6159,7 +6163,7 @@
     </w:p>
     <w:p>
       <w:pPr>
-        <w:pStyle w:val="1045"/>
+        <w:pStyle w:val="1055"/>
         <w:pBdr/>
         <w:spacing/>
         <w:ind/>
@@ -6211,7 +6215,7 @@
     </w:p>
     <w:p>
       <w:pPr>
-        <w:pStyle w:val="1045"/>
+        <w:pStyle w:val="1055"/>
         <w:pBdr/>
         <w:spacing/>
         <w:ind/>
@@ -6245,7 +6249,7 @@
     </w:p>
     <w:p>
       <w:pPr>
-        <w:pStyle w:val="1045"/>
+        <w:pStyle w:val="1055"/>
         <w:pBdr/>
         <w:spacing/>
         <w:ind/>
@@ -6279,7 +6283,7 @@
     </w:p>
     <w:p>
       <w:pPr>
-        <w:pStyle w:val="1045"/>
+        <w:pStyle w:val="1055"/>
         <w:pBdr/>
         <w:spacing/>
         <w:ind/>
@@ -6313,7 +6317,7 @@
     </w:p>
     <w:p>
       <w:pPr>
-        <w:pStyle w:val="1045"/>
+        <w:pStyle w:val="1055"/>
         <w:pBdr/>
         <w:spacing/>
         <w:ind/>
@@ -6347,7 +6351,7 @@
     </w:p>
     <w:p>
       <w:pPr>
-        <w:pStyle w:val="1045"/>
+        <w:pStyle w:val="1055"/>
         <w:pBdr/>
         <w:spacing/>
         <w:ind/>
@@ -6381,7 +6385,7 @@
     </w:p>
     <w:p>
       <w:pPr>
-        <w:pStyle w:val="1045"/>
+        <w:pStyle w:val="1055"/>
         <w:pBdr/>
         <w:spacing/>
         <w:ind w:left="0"/>
@@ -6392,7 +6396,7 @@
     </w:p>
     <w:p>
       <w:pPr>
-        <w:pStyle w:val="1045"/>
+        <w:pStyle w:val="1055"/>
         <w:pBdr/>
         <w:spacing/>
         <w:ind w:right="2753"/>
@@ -6459,7 +6463,7 @@
     </w:p>
     <w:p>
       <w:pPr>
-        <w:pStyle w:val="1045"/>
+        <w:pStyle w:val="1055"/>
         <w:pBdr/>
         <w:spacing/>
         <w:ind w:left="0"/>
@@ -6470,7 +6474,7 @@
     </w:p>
     <w:p>
       <w:pPr>
-        <w:pStyle w:val="1045"/>
+        <w:pStyle w:val="1055"/>
         <w:pBdr/>
         <w:spacing/>
         <w:ind/>
@@ -6489,7 +6493,7 @@
     </w:p>
     <w:p>
       <w:pPr>
-        <w:pStyle w:val="1045"/>
+        <w:pStyle w:val="1055"/>
         <w:pBdr/>
         <w:spacing/>
         <w:ind/>
@@ -6508,7 +6512,7 @@
     </w:p>
     <w:p>
       <w:pPr>
-        <w:pStyle w:val="1045"/>
+        <w:pStyle w:val="1055"/>
         <w:pBdr/>
         <w:spacing/>
         <w:ind w:right="7903"/>
@@ -6566,7 +6570,7 @@
     </w:p>
     <w:p>
       <w:pPr>
-        <w:pStyle w:val="1045"/>
+        <w:pStyle w:val="1055"/>
         <w:pBdr/>
         <w:spacing w:before="1"/>
         <w:ind w:left="0"/>
@@ -6577,7 +6581,7 @@
     </w:p>
     <w:p>
       <w:pPr>
-        <w:pStyle w:val="1045"/>
+        <w:pStyle w:val="1055"/>
         <w:pBdr/>
         <w:spacing/>
         <w:ind w:right="7744"/>
@@ -6632,7 +6636,7 @@
     </w:p>
     <w:p>
       <w:pPr>
-        <w:pStyle w:val="1045"/>
+        <w:pStyle w:val="1055"/>
         <w:pBdr/>
         <w:spacing/>
         <w:ind w:left="0"/>
@@ -6643,7 +6647,7 @@
     </w:p>
     <w:p>
       <w:pPr>
-        <w:pStyle w:val="1045"/>
+        <w:pStyle w:val="1055"/>
         <w:pBdr/>
         <w:spacing/>
         <w:ind w:right="9413"/>
@@ -6659,7 +6663,7 @@
     </w:p>
     <w:p>
       <w:pPr>
-        <w:pStyle w:val="1045"/>
+        <w:pStyle w:val="1055"/>
         <w:pBdr/>
         <w:spacing w:after="0"/>
         <w:ind/>
@@ -6678,7 +6682,7 @@
     </w:p>
     <w:p>
       <w:pPr>
-        <w:pStyle w:val="1045"/>
+        <w:pStyle w:val="1055"/>
         <w:pBdr/>
         <w:spacing w:after="1" w:before="112"/>
         <w:ind w:left="0"/>
@@ -6857,7 +6861,7 @@
     </w:p>
     <w:p>
       <w:pPr>
-        <w:pStyle w:val="1047"/>
+        <w:pStyle w:val="1057"/>
         <w:pBdr/>
         <w:spacing w:before="272"/>
         <w:ind/>
@@ -6895,7 +6899,7 @@
     </w:p>
     <w:p>
       <w:pPr>
-        <w:pStyle w:val="1045"/>
+        <w:pStyle w:val="1055"/>
         <w:pBdr/>
         <w:spacing/>
         <w:ind w:left="0"/>
@@ -6906,7 +6910,7 @@
     </w:p>
     <w:p>
       <w:pPr>
-        <w:pStyle w:val="1045"/>
+        <w:pStyle w:val="1055"/>
         <w:pBdr/>
         <w:spacing w:before="1"/>
         <w:ind w:left="0"/>
@@ -6917,7 +6921,7 @@
     </w:p>
     <w:p>
       <w:pPr>
-        <w:pStyle w:val="1048"/>
+        <w:pStyle w:val="1058"/>
         <w:numPr>
           <w:ilvl w:val="0"/>
           <w:numId w:val="1"/>
@@ -7104,7 +7108,7 @@
     </w:p>
     <w:p>
       <w:pPr>
-        <w:pStyle w:val="1045"/>
+        <w:pStyle w:val="1055"/>
         <w:pBdr/>
         <w:spacing w:line="276" w:lineRule="exact"/>
         <w:ind/>
@@ -7123,7 +7127,7 @@
     </w:p>
     <w:p>
       <w:pPr>
-        <w:pStyle w:val="1045"/>
+        <w:pStyle w:val="1055"/>
         <w:pBdr/>
         <w:spacing/>
         <w:ind/>
@@ -7166,7 +7170,7 @@
     </w:p>
     <w:p>
       <w:pPr>
-        <w:pStyle w:val="1045"/>
+        <w:pStyle w:val="1055"/>
         <w:pBdr/>
         <w:spacing/>
         <w:ind w:left="0"/>
@@ -7177,7 +7181,7 @@
     </w:p>
     <w:p>
       <w:pPr>
-        <w:pStyle w:val="1045"/>
+        <w:pStyle w:val="1055"/>
         <w:pBdr/>
         <w:spacing/>
         <w:ind/>
@@ -7202,7 +7206,7 @@
     </w:p>
     <w:p>
       <w:pPr>
-        <w:pStyle w:val="1045"/>
+        <w:pStyle w:val="1055"/>
         <w:pBdr/>
         <w:spacing/>
         <w:ind w:left="600"/>
@@ -7245,7 +7249,7 @@
     </w:p>
     <w:p>
       <w:pPr>
-        <w:pStyle w:val="1045"/>
+        <w:pStyle w:val="1055"/>
         <w:pBdr/>
         <w:spacing/>
         <w:ind w:left="0"/>
@@ -7256,7 +7260,7 @@
     </w:p>
     <w:p>
       <w:pPr>
-        <w:pStyle w:val="1045"/>
+        <w:pStyle w:val="1055"/>
         <w:pBdr/>
         <w:spacing/>
         <w:ind/>
@@ -7284,7 +7288,7 @@
     </w:p>
     <w:p>
       <w:pPr>
-        <w:pStyle w:val="1045"/>
+        <w:pStyle w:val="1055"/>
         <w:pBdr/>
         <w:spacing w:before="2" w:line="550" w:lineRule="atLeast"/>
         <w:ind w:right="4764"/>
@@ -7405,7 +7409,7 @@
     </w:p>
     <w:p>
       <w:pPr>
-        <w:pStyle w:val="1045"/>
+        <w:pStyle w:val="1055"/>
         <w:pBdr/>
         <w:spacing w:before="2"/>
         <w:ind/>
@@ -7460,7 +7464,7 @@
     </w:p>
     <w:p>
       <w:pPr>
-        <w:pStyle w:val="1045"/>
+        <w:pStyle w:val="1055"/>
         <w:pBdr/>
         <w:spacing w:after="0"/>
         <w:ind/>
@@ -7479,7 +7483,7 @@
     </w:p>
     <w:p>
       <w:pPr>
-        <w:pStyle w:val="1045"/>
+        <w:pStyle w:val="1055"/>
         <w:pBdr/>
         <w:spacing w:before="51"/>
         <w:ind w:left="0"/>
@@ -7490,7 +7494,7 @@
     </w:p>
     <w:p>
       <w:pPr>
-        <w:pStyle w:val="1045"/>
+        <w:pStyle w:val="1055"/>
         <w:pBdr/>
         <w:spacing w:before="1"/>
         <w:ind w:right="9413"/>
@@ -7515,7 +7519,7 @@
     </w:p>
     <w:p>
       <w:pPr>
-        <w:pStyle w:val="1045"/>
+        <w:pStyle w:val="1055"/>
         <w:pBdr/>
         <w:spacing w:before="36"/>
         <w:ind w:left="0"/>
@@ -7678,7 +7682,7 @@
     </w:p>
     <w:p>
       <w:pPr>
-        <w:pStyle w:val="1045"/>
+        <w:pStyle w:val="1055"/>
         <w:pBdr/>
         <w:spacing w:before="19"/>
         <w:ind w:left="0"/>
@@ -7689,7 +7693,7 @@
     </w:p>
     <w:p>
       <w:pPr>
-        <w:pStyle w:val="1047"/>
+        <w:pStyle w:val="1057"/>
         <w:pBdr/>
         <w:spacing w:before="1"/>
         <w:ind/>
@@ -7735,7 +7739,7 @@
     </w:p>
     <w:p>
       <w:pPr>
-        <w:pStyle w:val="1045"/>
+        <w:pStyle w:val="1055"/>
         <w:pBdr/>
         <w:spacing/>
         <w:ind w:left="0"/>
@@ -7746,7 +7750,7 @@
     </w:p>
     <w:p>
       <w:pPr>
-        <w:pStyle w:val="1045"/>
+        <w:pStyle w:val="1055"/>
         <w:pBdr/>
         <w:spacing w:before="1"/>
         <w:ind w:left="0"/>
@@ -7941,7 +7945,7 @@
     </w:p>
     <w:p>
       <w:pPr>
-        <w:pStyle w:val="1045"/>
+        <w:pStyle w:val="1055"/>
         <w:pBdr/>
         <w:spacing w:line="275" w:lineRule="exact"/>
         <w:ind/>
@@ -7960,7 +7964,7 @@
     </w:p>
     <w:p>
       <w:pPr>
-        <w:pStyle w:val="1045"/>
+        <w:pStyle w:val="1055"/>
         <w:pBdr/>
         <w:spacing/>
         <w:ind/>
@@ -8003,7 +8007,7 @@
     </w:p>
     <w:p>
       <w:pPr>
-        <w:pStyle w:val="1045"/>
+        <w:pStyle w:val="1055"/>
         <w:pBdr/>
         <w:spacing w:before="276"/>
         <w:ind/>
@@ -8031,7 +8035,7 @@
     </w:p>
     <w:p>
       <w:pPr>
-        <w:pStyle w:val="1045"/>
+        <w:pStyle w:val="1055"/>
         <w:pBdr/>
         <w:spacing/>
         <w:ind w:left="600"/>
@@ -8059,7 +8063,7 @@
     </w:p>
     <w:p>
       <w:pPr>
-        <w:pStyle w:val="1045"/>
+        <w:pStyle w:val="1055"/>
         <w:pBdr/>
         <w:spacing w:after="0"/>
         <w:ind/>
@@ -8078,7 +8082,7 @@
     </w:p>
     <w:p>
       <w:pPr>
-        <w:pStyle w:val="1045"/>
+        <w:pStyle w:val="1055"/>
         <w:pBdr/>
         <w:spacing w:before="51"/>
         <w:ind w:left="0"/>
@@ -8089,7 +8093,7 @@
     </w:p>
     <w:p>
       <w:pPr>
-        <w:pStyle w:val="1045"/>
+        <w:pStyle w:val="1055"/>
         <w:pBdr/>
         <w:spacing w:before="1"/>
         <w:ind w:right="8897" w:left="600"/>
@@ -8138,7 +8142,7 @@
     </w:p>
     <w:p>
       <w:pPr>
-        <w:pStyle w:val="1045"/>
+        <w:pStyle w:val="1055"/>
         <w:pBdr/>
         <w:spacing/>
         <w:ind w:left="0"/>
@@ -8149,7 +8153,7 @@
     </w:p>
     <w:p>
       <w:pPr>
-        <w:pStyle w:val="1045"/>
+        <w:pStyle w:val="1055"/>
         <w:pBdr/>
         <w:spacing/>
         <w:ind/>
@@ -8192,7 +8196,7 @@
     </w:p>
     <w:p>
       <w:pPr>
-        <w:pStyle w:val="1045"/>
+        <w:pStyle w:val="1055"/>
         <w:pBdr/>
         <w:spacing w:before="2" w:line="550" w:lineRule="atLeast"/>
         <w:ind w:right="4764"/>
@@ -8298,7 +8302,7 @@
     </w:p>
     <w:p>
       <w:pPr>
-        <w:pStyle w:val="1045"/>
+        <w:pStyle w:val="1055"/>
         <w:pBdr/>
         <w:spacing w:before="2"/>
         <w:ind w:right="6668"/>
@@ -8371,7 +8375,7 @@
     </w:p>
     <w:p>
       <w:pPr>
-        <w:pStyle w:val="1045"/>
+        <w:pStyle w:val="1055"/>
         <w:pBdr/>
         <w:spacing/>
         <w:ind w:right="9413"/>
@@ -8396,7 +8400,7 @@
     </w:p>
     <w:p>
       <w:pPr>
-        <w:pStyle w:val="1045"/>
+        <w:pStyle w:val="1055"/>
         <w:pBdr/>
         <w:spacing w:before="36"/>
         <w:ind w:left="0"/>
@@ -8559,7 +8563,7 @@
     </w:p>
     <w:p>
       <w:pPr>
-        <w:pStyle w:val="1045"/>
+        <w:pStyle w:val="1055"/>
         <w:pBdr/>
         <w:spacing w:before="25"/>
         <w:ind w:left="0"/>
@@ -8570,7 +8574,7 @@
     </w:p>
     <w:p>
       <w:pPr>
-        <w:pStyle w:val="1047"/>
+        <w:pStyle w:val="1057"/>
         <w:pBdr/>
         <w:spacing/>
         <w:ind/>
@@ -8586,7 +8590,7 @@
     </w:p>
     <w:p>
       <w:pPr>
-        <w:pStyle w:val="1045"/>
+        <w:pStyle w:val="1055"/>
         <w:pBdr/>
         <w:spacing/>
         <w:ind w:right="743"/>
@@ -8602,7 +8606,7 @@
     </w:p>
     <w:p>
       <w:pPr>
-        <w:pStyle w:val="1045"/>
+        <w:pStyle w:val="1055"/>
         <w:pBdr/>
         <w:spacing/>
         <w:ind w:left="0"/>
@@ -8613,7 +8617,7 @@
     </w:p>
     <w:p>
       <w:pPr>
-        <w:pStyle w:val="1047"/>
+        <w:pStyle w:val="1057"/>
         <w:pBdr/>
         <w:spacing/>
         <w:ind/>
@@ -8636,12 +8640,16 @@
     </w:p>
     <w:p>
       <w:pPr>
-        <w:pStyle w:val="1045"/>
+        <w:pStyle w:val="1055"/>
         <w:pBdr/>
         <w:spacing/>
         <w:ind/>
         <w:rPr/>
       </w:pPr>
+      <w:r/>
+      <w:r>
+        <w:t xml:space="preserve">https://github.com/aumdave1979/DSIP.git</w:t>
+      </w:r>
       <w:r/>
       <w:r/>
     </w:p>
@@ -8727,7 +8735,7 @@
 <w:hdr xmlns:wpc="http://schemas.microsoft.com/office/word/2010/wordprocessingCanvas" xmlns:mc="http://schemas.openxmlformats.org/markup-compatibility/2006" xmlns:o="urn:schemas-microsoft-com:office:office" xmlns:r="http://schemas.openxmlformats.org/officeDocument/2006/relationships" xmlns:m="http://schemas.openxmlformats.org/officeDocument/2006/math" xmlns:v="urn:schemas-microsoft-com:vml" xmlns:wp14="http://schemas.microsoft.com/office/word/2010/wordprocessingDrawing" xmlns:wp="http://schemas.openxmlformats.org/drawingml/2006/wordprocessingDrawing" xmlns:w10="urn:schemas-microsoft-com:office:word" xmlns:w="http://schemas.openxmlformats.org/wordprocessingml/2006/main" xmlns:w14="http://schemas.microsoft.com/office/word/2010/wordml" xmlns:w15="http://schemas.microsoft.com/office/word/2012/wordml" xmlns:wpg="http://schemas.microsoft.com/office/word/2010/wordprocessingGroup" xmlns:wpi="http://schemas.microsoft.com/office/word/2010/wordprocessingInk" xmlns:wne="http://schemas.microsoft.com/office/word/2006/wordml" xmlns:a="http://schemas.openxmlformats.org/drawingml/2006/main" xmlns:wps="http://schemas.microsoft.com/office/word/2010/wordprocessingShape" mc:Ignorable="w14 w15 wp14">
   <w:p>
     <w:pPr>
-      <w:pStyle w:val="1045"/>
+      <w:pStyle w:val="1055"/>
       <w:pBdr/>
       <w:spacing w:line="14" w:lineRule="auto"/>
       <w:ind w:left="0"/>
@@ -8808,7 +8816,7 @@
                               </w:tcPr>
                               <w:p>
                                 <w:pPr>
-                                  <w:pStyle w:val="1049"/>
+                                  <w:pStyle w:val="1059"/>
                                   <w:pBdr/>
                                   <w:spacing/>
                                   <w:ind w:left="0"/>
@@ -8841,7 +8849,7 @@
                               </w:tcPr>
                               <w:p>
                                 <w:pPr>
-                                  <w:pStyle w:val="1049"/>
+                                  <w:pStyle w:val="1059"/>
                                   <w:pBdr/>
                                   <w:spacing w:before="148"/>
                                   <w:ind/>
@@ -8880,7 +8888,7 @@
                               </w:p>
                               <w:p>
                                 <w:pPr>
-                                  <w:pStyle w:val="1049"/>
+                                  <w:pStyle w:val="1059"/>
                                   <w:pBdr/>
                                   <w:spacing w:before="48"/>
                                   <w:ind/>
@@ -8940,7 +8948,7 @@
                               </w:p>
                               <w:p>
                                 <w:pPr>
-                                  <w:pStyle w:val="1049"/>
+                                  <w:pStyle w:val="1059"/>
                                   <w:pBdr/>
                                   <w:spacing w:before="51"/>
                                   <w:ind/>
@@ -9018,7 +9026,7 @@
                               </w:tcPr>
                               <w:p>
                                 <w:pPr>
-                                  <w:pStyle w:val="1049"/>
+                                  <w:pStyle w:val="1059"/>
                                   <w:pBdr/>
                                   <w:spacing w:before="51" w:line="276" w:lineRule="auto"/>
                                   <w:ind w:firstLine="156" w:left="160"/>
@@ -9070,7 +9078,7 @@
                               </w:tcPr>
                               <w:p>
                                 <w:pPr>
-                                  <w:pStyle w:val="1049"/>
+                                  <w:pStyle w:val="1059"/>
                                   <w:pBdr/>
                                   <w:spacing w:line="367" w:lineRule="exact"/>
                                   <w:ind w:left="108"/>
@@ -9134,7 +9142,7 @@
                               </w:tcPr>
                               <w:p>
                                 <w:pPr>
-                                  <w:pStyle w:val="1049"/>
+                                  <w:pStyle w:val="1059"/>
                                   <w:pBdr/>
                                   <w:spacing w:line="275" w:lineRule="exact"/>
                                   <w:ind w:left="734"/>
@@ -9186,7 +9194,7 @@
                               </w:tcPr>
                               <w:p>
                                 <w:pPr>
-                                  <w:pStyle w:val="1049"/>
+                                  <w:pStyle w:val="1059"/>
                                   <w:pBdr/>
                                   <w:spacing w:line="275" w:lineRule="exact"/>
                                   <w:ind w:left="108"/>
@@ -9224,7 +9232,7 @@
                               </w:tcPr>
                               <w:p>
                                 <w:pPr>
-                                  <w:pStyle w:val="1049"/>
+                                  <w:pStyle w:val="1059"/>
                                   <w:pBdr/>
                                   <w:spacing w:line="275" w:lineRule="exact"/>
                                   <w:ind w:left="106"/>
@@ -9273,7 +9281,7 @@
                         </w:tbl>
                         <w:p>
                           <w:pPr>
-                            <w:pStyle w:val="1045"/>
+                            <w:pStyle w:val="1055"/>
                             <w:pBdr/>
                             <w:spacing/>
                             <w:ind w:left="0"/>
@@ -9335,7 +9343,7 @@
                         </w:tcPr>
                         <w:p>
                           <w:pPr>
-                            <w:pStyle w:val="1049"/>
+                            <w:pStyle w:val="1059"/>
                             <w:pBdr/>
                             <w:spacing/>
                             <w:ind w:left="0"/>
@@ -9368,7 +9376,7 @@
                         </w:tcPr>
                         <w:p>
                           <w:pPr>
-                            <w:pStyle w:val="1049"/>
+                            <w:pStyle w:val="1059"/>
                             <w:pBdr/>
                             <w:spacing w:before="148"/>
                             <w:ind/>
@@ -9407,7 +9415,7 @@
                         </w:p>
                         <w:p>
                           <w:pPr>
-                            <w:pStyle w:val="1049"/>
+                            <w:pStyle w:val="1059"/>
                             <w:pBdr/>
                             <w:spacing w:before="48"/>
                             <w:ind/>
@@ -9467,7 +9475,7 @@
                         </w:p>
                         <w:p>
                           <w:pPr>
-                            <w:pStyle w:val="1049"/>
+                            <w:pStyle w:val="1059"/>
                             <w:pBdr/>
                             <w:spacing w:before="51"/>
                             <w:ind/>
@@ -9545,7 +9553,7 @@
                         </w:tcPr>
                         <w:p>
                           <w:pPr>
-                            <w:pStyle w:val="1049"/>
+                            <w:pStyle w:val="1059"/>
                             <w:pBdr/>
                             <w:spacing w:before="51" w:line="276" w:lineRule="auto"/>
                             <w:ind w:firstLine="156" w:left="160"/>
@@ -9597,7 +9605,7 @@
                         </w:tcPr>
                         <w:p>
                           <w:pPr>
-                            <w:pStyle w:val="1049"/>
+                            <w:pStyle w:val="1059"/>
                             <w:pBdr/>
                             <w:spacing w:line="367" w:lineRule="exact"/>
                             <w:ind w:left="108"/>
@@ -9661,7 +9669,7 @@
                         </w:tcPr>
                         <w:p>
                           <w:pPr>
-                            <w:pStyle w:val="1049"/>
+                            <w:pStyle w:val="1059"/>
                             <w:pBdr/>
                             <w:spacing w:line="275" w:lineRule="exact"/>
                             <w:ind w:left="734"/>
@@ -9713,7 +9721,7 @@
                         </w:tcPr>
                         <w:p>
                           <w:pPr>
-                            <w:pStyle w:val="1049"/>
+                            <w:pStyle w:val="1059"/>
                             <w:pBdr/>
                             <w:spacing w:line="275" w:lineRule="exact"/>
                             <w:ind w:left="108"/>
@@ -9751,7 +9759,7 @@
                         </w:tcPr>
                         <w:p>
                           <w:pPr>
-                            <w:pStyle w:val="1049"/>
+                            <w:pStyle w:val="1059"/>
                             <w:pBdr/>
                             <w:spacing w:line="275" w:lineRule="exact"/>
                             <w:ind w:left="106"/>
@@ -9800,7 +9808,7 @@
                   </w:tbl>
                   <w:p>
                     <w:pPr>
-                      <w:pStyle w:val="1045"/>
+                      <w:pStyle w:val="1055"/>
                       <w:pBdr/>
                       <w:spacing/>
                       <w:ind w:left="0"/>
@@ -10231,7 +10239,7 @@
     <w:lsdException w:name="Bibliography" w:uiPriority="37"/>
     <w:lsdException w:name="TOC Heading" w:uiPriority="39" w:qFormat="1"/>
   </w:latentStyles>
-  <w:style w:type="table" w:styleId="857" w:default="1">
+  <w:style w:type="table" w:styleId="867" w:default="1">
     <w:name w:val="Normal Table"/>
     <w:uiPriority w:val="99"/>
     <w:semiHidden/>
@@ -10424,9 +10432,9 @@
       </w:tcPr>
     </w:tblStylePr>
   </w:style>
-  <w:style w:type="table" w:styleId="858">
+  <w:style w:type="table" w:styleId="868">
     <w:name w:val="Table Grid"/>
-    <w:basedOn w:val="857"/>
+    <w:basedOn w:val="867"/>
     <w:uiPriority w:val="59"/>
     <w:pPr>
       <w:pBdr/>
@@ -10623,9 +10631,9 @@
       </w:tcPr>
     </w:tblStylePr>
   </w:style>
-  <w:style w:type="table" w:styleId="859">
+  <w:style w:type="table" w:styleId="869">
     <w:name w:val="Table Grid Light"/>
-    <w:basedOn w:val="857"/>
+    <w:basedOn w:val="867"/>
     <w:uiPriority w:val="59"/>
     <w:pPr>
       <w:pBdr/>
@@ -10822,9 +10830,9 @@
       </w:tcPr>
     </w:tblStylePr>
   </w:style>
-  <w:style w:type="table" w:styleId="860">
+  <w:style w:type="table" w:styleId="870">
     <w:name w:val="Plain Table 1"/>
-    <w:basedOn w:val="857"/>
+    <w:basedOn w:val="867"/>
     <w:uiPriority w:val="59"/>
     <w:pPr>
       <w:pBdr/>
@@ -11047,9 +11055,9 @@
       </w:tcPr>
     </w:tblStylePr>
   </w:style>
-  <w:style w:type="table" w:styleId="861">
+  <w:style w:type="table" w:styleId="871">
     <w:name w:val="Plain Table 2"/>
-    <w:basedOn w:val="857"/>
+    <w:basedOn w:val="867"/>
     <w:uiPriority w:val="59"/>
     <w:pPr>
       <w:pBdr/>
@@ -11280,9 +11288,9 @@
       </w:tcPr>
     </w:tblStylePr>
   </w:style>
-  <w:style w:type="table" w:styleId="862">
+  <w:style w:type="table" w:styleId="872">
     <w:name w:val="Plain Table 3"/>
-    <w:basedOn w:val="857"/>
+    <w:basedOn w:val="867"/>
     <w:uiPriority w:val="99"/>
     <w:pPr>
       <w:pBdr/>
@@ -11510,9 +11518,9 @@
       </w:tcPr>
     </w:tblStylePr>
   </w:style>
-  <w:style w:type="table" w:styleId="863">
+  <w:style w:type="table" w:styleId="873">
     <w:name w:val="Plain Table 4"/>
-    <w:basedOn w:val="857"/>
+    <w:basedOn w:val="867"/>
     <w:uiPriority w:val="99"/>
     <w:pPr>
       <w:pBdr/>
@@ -11726,9 +11734,9 @@
       </w:tcPr>
     </w:tblStylePr>
   </w:style>
-  <w:style w:type="table" w:styleId="864">
+  <w:style w:type="table" w:styleId="874">
     <w:name w:val="Plain Table 5"/>
-    <w:basedOn w:val="857"/>
+    <w:basedOn w:val="867"/>
     <w:uiPriority w:val="99"/>
     <w:pPr>
       <w:pBdr/>
@@ -11959,9 +11967,9 @@
       </w:tcPr>
     </w:tblStylePr>
   </w:style>
-  <w:style w:type="table" w:styleId="865">
+  <w:style w:type="table" w:styleId="875">
     <w:name w:val="Grid Table 1 Light"/>
-    <w:basedOn w:val="857"/>
+    <w:basedOn w:val="867"/>
     <w:uiPriority w:val="99"/>
     <w:pPr>
       <w:pBdr/>
@@ -12182,9 +12190,9 @@
       </w:tcPr>
     </w:tblStylePr>
   </w:style>
-  <w:style w:type="table" w:styleId="866">
+  <w:style w:type="table" w:styleId="876">
     <w:name w:val="Grid Table 1 Light - Accent 1"/>
-    <w:basedOn w:val="857"/>
+    <w:basedOn w:val="867"/>
     <w:uiPriority w:val="99"/>
     <w:pPr>
       <w:pBdr/>
@@ -12405,9 +12413,9 @@
       </w:tcPr>
     </w:tblStylePr>
   </w:style>
-  <w:style w:type="table" w:styleId="867">
+  <w:style w:type="table" w:styleId="877">
     <w:name w:val="Grid Table 1 Light - Accent 2"/>
-    <w:basedOn w:val="857"/>
+    <w:basedOn w:val="867"/>
     <w:uiPriority w:val="99"/>
     <w:pPr>
       <w:pBdr/>
@@ -12628,9 +12636,9 @@
       </w:tcPr>
     </w:tblStylePr>
   </w:style>
-  <w:style w:type="table" w:styleId="868">
+  <w:style w:type="table" w:styleId="878">
     <w:name w:val="Grid Table 1 Light - Accent 3"/>
-    <w:basedOn w:val="857"/>
+    <w:basedOn w:val="867"/>
     <w:uiPriority w:val="99"/>
     <w:pPr>
       <w:pBdr/>
@@ -12851,9 +12859,9 @@
       </w:tcPr>
     </w:tblStylePr>
   </w:style>
-  <w:style w:type="table" w:styleId="869">
+  <w:style w:type="table" w:styleId="879">
     <w:name w:val="Grid Table 1 Light - Accent 4"/>
-    <w:basedOn w:val="857"/>
+    <w:basedOn w:val="867"/>
     <w:uiPriority w:val="99"/>
     <w:pPr>
       <w:pBdr/>
@@ -13074,9 +13082,9 @@
       </w:tcPr>
     </w:tblStylePr>
   </w:style>
-  <w:style w:type="table" w:styleId="870">
+  <w:style w:type="table" w:styleId="880">
     <w:name w:val="Grid Table 1 Light - Accent 5"/>
-    <w:basedOn w:val="857"/>
+    <w:basedOn w:val="867"/>
     <w:uiPriority w:val="99"/>
     <w:pPr>
       <w:pBdr/>
@@ -13297,9 +13305,9 @@
       </w:tcPr>
     </w:tblStylePr>
   </w:style>
-  <w:style w:type="table" w:styleId="871">
+  <w:style w:type="table" w:styleId="881">
     <w:name w:val="Grid Table 1 Light - Accent 6"/>
-    <w:basedOn w:val="857"/>
+    <w:basedOn w:val="867"/>
     <w:uiPriority w:val="99"/>
     <w:pPr>
       <w:pBdr/>
@@ -13520,9 +13528,9 @@
       </w:tcPr>
     </w:tblStylePr>
   </w:style>
-  <w:style w:type="table" w:styleId="872">
+  <w:style w:type="table" w:styleId="882">
     <w:name w:val="Grid Table 2"/>
-    <w:basedOn w:val="857"/>
+    <w:basedOn w:val="867"/>
     <w:uiPriority w:val="99"/>
     <w:pPr>
       <w:pBdr/>
@@ -13752,9 +13760,9 @@
       </w:tcPr>
     </w:tblStylePr>
   </w:style>
-  <w:style w:type="table" w:styleId="873">
+  <w:style w:type="table" w:styleId="883">
     <w:name w:val="Grid Table 2 - Accent 1"/>
-    <w:basedOn w:val="857"/>
+    <w:basedOn w:val="867"/>
     <w:uiPriority w:val="99"/>
     <w:pPr>
       <w:pBdr/>
@@ -13984,9 +13992,9 @@
       </w:tcPr>
     </w:tblStylePr>
   </w:style>
-  <w:style w:type="table" w:styleId="874">
+  <w:style w:type="table" w:styleId="884">
     <w:name w:val="Grid Table 2 - Accent 2"/>
-    <w:basedOn w:val="857"/>
+    <w:basedOn w:val="867"/>
     <w:uiPriority w:val="99"/>
     <w:pPr>
       <w:pBdr/>
@@ -14216,9 +14224,9 @@
       </w:tcPr>
     </w:tblStylePr>
   </w:style>
-  <w:style w:type="table" w:styleId="875">
+  <w:style w:type="table" w:styleId="885">
     <w:name w:val="Grid Table 2 - Accent 3"/>
-    <w:basedOn w:val="857"/>
+    <w:basedOn w:val="867"/>
     <w:uiPriority w:val="99"/>
     <w:pPr>
       <w:pBdr/>
@@ -14448,9 +14456,9 @@
       </w:tcPr>
     </w:tblStylePr>
   </w:style>
-  <w:style w:type="table" w:styleId="876">
+  <w:style w:type="table" w:styleId="886">
     <w:name w:val="Grid Table 2 - Accent 4"/>
-    <w:basedOn w:val="857"/>
+    <w:basedOn w:val="867"/>
     <w:uiPriority w:val="99"/>
     <w:pPr>
       <w:pBdr/>
@@ -14680,9 +14688,9 @@
       </w:tcPr>
     </w:tblStylePr>
   </w:style>
-  <w:style w:type="table" w:styleId="877">
+  <w:style w:type="table" w:styleId="887">
     <w:name w:val="Grid Table 2 - Accent 5"/>
-    <w:basedOn w:val="857"/>
+    <w:basedOn w:val="867"/>
     <w:uiPriority w:val="99"/>
     <w:pPr>
       <w:pBdr/>
@@ -14912,9 +14920,9 @@
       </w:tcPr>
     </w:tblStylePr>
   </w:style>
-  <w:style w:type="table" w:styleId="878">
+  <w:style w:type="table" w:styleId="888">
     <w:name w:val="Grid Table 2 - Accent 6"/>
-    <w:basedOn w:val="857"/>
+    <w:basedOn w:val="867"/>
     <w:uiPriority w:val="99"/>
     <w:pPr>
       <w:pBdr/>
@@ -15144,9 +15152,9 @@
       </w:tcPr>
     </w:tblStylePr>
   </w:style>
-  <w:style w:type="table" w:styleId="879">
+  <w:style w:type="table" w:styleId="889">
     <w:name w:val="Grid Table 3"/>
-    <w:basedOn w:val="857"/>
+    <w:basedOn w:val="867"/>
     <w:uiPriority w:val="99"/>
     <w:pPr>
       <w:pBdr/>
@@ -15389,9 +15397,9 @@
       </w:tcPr>
     </w:tblStylePr>
   </w:style>
-  <w:style w:type="table" w:styleId="880">
+  <w:style w:type="table" w:styleId="890">
     <w:name w:val="Grid Table 3 - Accent 1"/>
-    <w:basedOn w:val="857"/>
+    <w:basedOn w:val="867"/>
     <w:uiPriority w:val="99"/>
     <w:pPr>
       <w:pBdr/>
@@ -15634,9 +15642,9 @@
       </w:tcPr>
     </w:tblStylePr>
   </w:style>
-  <w:style w:type="table" w:styleId="881">
+  <w:style w:type="table" w:styleId="891">
     <w:name w:val="Grid Table 3 - Accent 2"/>
-    <w:basedOn w:val="857"/>
+    <w:basedOn w:val="867"/>
     <w:uiPriority w:val="99"/>
     <w:pPr>
       <w:pBdr/>
@@ -15879,9 +15887,9 @@
       </w:tcPr>
     </w:tblStylePr>
   </w:style>
-  <w:style w:type="table" w:styleId="882">
+  <w:style w:type="table" w:styleId="892">
     <w:name w:val="Grid Table 3 - Accent 3"/>
-    <w:basedOn w:val="857"/>
+    <w:basedOn w:val="867"/>
     <w:uiPriority w:val="99"/>
     <w:pPr>
       <w:pBdr/>
@@ -16124,9 +16132,9 @@
       </w:tcPr>
     </w:tblStylePr>
   </w:style>
-  <w:style w:type="table" w:styleId="883">
+  <w:style w:type="table" w:styleId="893">
     <w:name w:val="Grid Table 3 - Accent 4"/>
-    <w:basedOn w:val="857"/>
+    <w:basedOn w:val="867"/>
     <w:uiPriority w:val="99"/>
     <w:pPr>
       <w:pBdr/>
@@ -16369,9 +16377,9 @@
       </w:tcPr>
     </w:tblStylePr>
   </w:style>
-  <w:style w:type="table" w:styleId="884">
+  <w:style w:type="table" w:styleId="894">
     <w:name w:val="Grid Table 3 - Accent 5"/>
-    <w:basedOn w:val="857"/>
+    <w:basedOn w:val="867"/>
     <w:uiPriority w:val="99"/>
     <w:pPr>
       <w:pBdr/>
@@ -16614,9 +16622,9 @@
       </w:tcPr>
     </w:tblStylePr>
   </w:style>
-  <w:style w:type="table" w:styleId="885">
+  <w:style w:type="table" w:styleId="895">
     <w:name w:val="Grid Table 3 - Accent 6"/>
-    <w:basedOn w:val="857"/>
+    <w:basedOn w:val="867"/>
     <w:uiPriority w:val="99"/>
     <w:pPr>
       <w:pBdr/>
@@ -16859,9 +16867,9 @@
       </w:tcPr>
     </w:tblStylePr>
   </w:style>
-  <w:style w:type="table" w:styleId="886">
+  <w:style w:type="table" w:styleId="896">
     <w:name w:val="Grid Table 4"/>
-    <w:basedOn w:val="857"/>
+    <w:basedOn w:val="867"/>
     <w:uiPriority w:val="59"/>
     <w:pPr>
       <w:pBdr/>
@@ -17092,9 +17100,9 @@
       </w:tcPr>
     </w:tblStylePr>
   </w:style>
-  <w:style w:type="table" w:styleId="887">
+  <w:style w:type="table" w:styleId="897">
     <w:name w:val="Grid Table 4 - Accent 1"/>
-    <w:basedOn w:val="857"/>
+    <w:basedOn w:val="867"/>
     <w:uiPriority w:val="59"/>
     <w:pPr>
       <w:pBdr/>
@@ -17325,9 +17333,9 @@
       </w:tcPr>
     </w:tblStylePr>
   </w:style>
-  <w:style w:type="table" w:styleId="888">
+  <w:style w:type="table" w:styleId="898">
     <w:name w:val="Grid Table 4 - Accent 2"/>
-    <w:basedOn w:val="857"/>
+    <w:basedOn w:val="867"/>
     <w:uiPriority w:val="59"/>
     <w:pPr>
       <w:pBdr/>
@@ -17558,9 +17566,9 @@
       </w:tcPr>
     </w:tblStylePr>
   </w:style>
-  <w:style w:type="table" w:styleId="889">
+  <w:style w:type="table" w:styleId="899">
     <w:name w:val="Grid Table 4 - Accent 3"/>
-    <w:basedOn w:val="857"/>
+    <w:basedOn w:val="867"/>
     <w:uiPriority w:val="59"/>
     <w:pPr>
       <w:pBdr/>
@@ -17791,9 +17799,9 @@
       </w:tcPr>
     </w:tblStylePr>
   </w:style>
-  <w:style w:type="table" w:styleId="890">
+  <w:style w:type="table" w:styleId="900">
     <w:name w:val="Grid Table 4 - Accent 4"/>
-    <w:basedOn w:val="857"/>
+    <w:basedOn w:val="867"/>
     <w:uiPriority w:val="59"/>
     <w:pPr>
       <w:pBdr/>
@@ -18024,9 +18032,9 @@
       </w:tcPr>
     </w:tblStylePr>
   </w:style>
-  <w:style w:type="table" w:styleId="891">
+  <w:style w:type="table" w:styleId="901">
     <w:name w:val="Grid Table 4 - Accent 5"/>
-    <w:basedOn w:val="857"/>
+    <w:basedOn w:val="867"/>
     <w:uiPriority w:val="59"/>
     <w:pPr>
       <w:pBdr/>
@@ -18257,9 +18265,9 @@
       </w:tcPr>
     </w:tblStylePr>
   </w:style>
-  <w:style w:type="table" w:styleId="892">
+  <w:style w:type="table" w:styleId="902">
     <w:name w:val="Grid Table 4 - Accent 6"/>
-    <w:basedOn w:val="857"/>
+    <w:basedOn w:val="867"/>
     <w:uiPriority w:val="59"/>
     <w:pPr>
       <w:pBdr/>
@@ -18490,9 +18498,9 @@
       </w:tcPr>
     </w:tblStylePr>
   </w:style>
-  <w:style w:type="table" w:styleId="893">
+  <w:style w:type="table" w:styleId="903">
     <w:name w:val="Grid Table 5 Dark"/>
-    <w:basedOn w:val="857"/>
+    <w:basedOn w:val="867"/>
     <w:uiPriority w:val="99"/>
     <w:pPr>
       <w:pBdr/>
@@ -18718,9 +18726,9 @@
       </w:tcPr>
     </w:tblStylePr>
   </w:style>
-  <w:style w:type="table" w:styleId="894">
+  <w:style w:type="table" w:styleId="904">
     <w:name w:val="Grid Table 5 Dark- Accent 1"/>
-    <w:basedOn w:val="857"/>
+    <w:basedOn w:val="867"/>
     <w:uiPriority w:val="99"/>
     <w:pPr>
       <w:pBdr/>
@@ -18946,9 +18954,9 @@
       </w:tcPr>
     </w:tblStylePr>
   </w:style>
-  <w:style w:type="table" w:styleId="895">
+  <w:style w:type="table" w:styleId="905">
     <w:name w:val="Grid Table 5 Dark - Accent 2"/>
-    <w:basedOn w:val="857"/>
+    <w:basedOn w:val="867"/>
     <w:uiPriority w:val="99"/>
     <w:pPr>
       <w:pBdr/>
@@ -19174,9 +19182,9 @@
       </w:tcPr>
     </w:tblStylePr>
   </w:style>
-  <w:style w:type="table" w:styleId="896">
+  <w:style w:type="table" w:styleId="906">
     <w:name w:val="Grid Table 5 Dark - Accent 3"/>
-    <w:basedOn w:val="857"/>
+    <w:basedOn w:val="867"/>
     <w:uiPriority w:val="99"/>
     <w:pPr>
       <w:pBdr/>
@@ -19402,9 +19410,9 @@
       </w:tcPr>
     </w:tblStylePr>
   </w:style>
-  <w:style w:type="table" w:styleId="897">
+  <w:style w:type="table" w:styleId="907">
     <w:name w:val="Grid Table 5 Dark- Accent 4"/>
-    <w:basedOn w:val="857"/>
+    <w:basedOn w:val="867"/>
     <w:uiPriority w:val="99"/>
     <w:pPr>
       <w:pBdr/>
@@ -19630,9 +19638,9 @@
       </w:tcPr>
     </w:tblStylePr>
   </w:style>
-  <w:style w:type="table" w:styleId="898">
+  <w:style w:type="table" w:styleId="908">
     <w:name w:val="Grid Table 5 Dark - Accent 5"/>
-    <w:basedOn w:val="857"/>
+    <w:basedOn w:val="867"/>
     <w:uiPriority w:val="99"/>
     <w:pPr>
       <w:pBdr/>
@@ -19858,9 +19866,9 @@
       </w:tcPr>
     </w:tblStylePr>
   </w:style>
-  <w:style w:type="table" w:styleId="899">
+  <w:style w:type="table" w:styleId="909">
     <w:name w:val="Grid Table 5 Dark - Accent 6"/>
-    <w:basedOn w:val="857"/>
+    <w:basedOn w:val="867"/>
     <w:uiPriority w:val="99"/>
     <w:pPr>
       <w:pBdr/>
@@ -20086,9 +20094,9 @@
       </w:tcPr>
     </w:tblStylePr>
   </w:style>
-  <w:style w:type="table" w:styleId="900">
+  <w:style w:type="table" w:styleId="910">
     <w:name w:val="Grid Table 6 Colorful"/>
-    <w:basedOn w:val="857"/>
+    <w:basedOn w:val="867"/>
     <w:uiPriority w:val="99"/>
     <w:pPr>
       <w:pBdr/>
@@ -20316,9 +20324,9 @@
       </w:tcPr>
     </w:tblStylePr>
   </w:style>
-  <w:style w:type="table" w:styleId="901">
+  <w:style w:type="table" w:styleId="911">
     <w:name w:val="Grid Table 6 Colorful - Accent 1"/>
-    <w:basedOn w:val="857"/>
+    <w:basedOn w:val="867"/>
     <w:uiPriority w:val="99"/>
     <w:pPr>
       <w:pBdr/>
@@ -20546,9 +20554,9 @@
       </w:tcPr>
     </w:tblStylePr>
   </w:style>
-  <w:style w:type="table" w:styleId="902">
+  <w:style w:type="table" w:styleId="912">
     <w:name w:val="Grid Table 6 Colorful - Accent 2"/>
-    <w:basedOn w:val="857"/>
+    <w:basedOn w:val="867"/>
     <w:uiPriority w:val="99"/>
     <w:pPr>
       <w:pBdr/>
@@ -20776,9 +20784,9 @@
       </w:tcPr>
     </w:tblStylePr>
   </w:style>
-  <w:style w:type="table" w:styleId="903">
+  <w:style w:type="table" w:styleId="913">
     <w:name w:val="Grid Table 6 Colorful - Accent 3"/>
-    <w:basedOn w:val="857"/>
+    <w:basedOn w:val="867"/>
     <w:uiPriority w:val="99"/>
     <w:pPr>
       <w:pBdr/>
@@ -21006,9 +21014,9 @@
       </w:tcPr>
     </w:tblStylePr>
   </w:style>
-  <w:style w:type="table" w:styleId="904">
+  <w:style w:type="table" w:styleId="914">
     <w:name w:val="Grid Table 6 Colorful - Accent 4"/>
-    <w:basedOn w:val="857"/>
+    <w:basedOn w:val="867"/>
     <w:uiPriority w:val="99"/>
     <w:pPr>
       <w:pBdr/>
@@ -21236,9 +21244,9 @@
       </w:tcPr>
     </w:tblStylePr>
   </w:style>
-  <w:style w:type="table" w:styleId="905">
+  <w:style w:type="table" w:styleId="915">
     <w:name w:val="Grid Table 6 Colorful - Accent 5"/>
-    <w:basedOn w:val="857"/>
+    <w:basedOn w:val="867"/>
     <w:uiPriority w:val="99"/>
     <w:pPr>
       <w:pBdr/>
@@ -21466,9 +21474,9 @@
       </w:tcPr>
     </w:tblStylePr>
   </w:style>
-  <w:style w:type="table" w:styleId="906">
+  <w:style w:type="table" w:styleId="916">
     <w:name w:val="Grid Table 6 Colorful - Accent 6"/>
-    <w:basedOn w:val="857"/>
+    <w:basedOn w:val="867"/>
     <w:uiPriority w:val="99"/>
     <w:pPr>
       <w:pBdr/>
@@ -21696,9 +21704,9 @@
       </w:tcPr>
     </w:tblStylePr>
   </w:style>
-  <w:style w:type="table" w:styleId="907">
+  <w:style w:type="table" w:styleId="917">
     <w:name w:val="Grid Table 7 Colorful"/>
-    <w:basedOn w:val="857"/>
+    <w:basedOn w:val="867"/>
     <w:uiPriority w:val="99"/>
     <w:pPr>
       <w:pBdr/>
@@ -21950,9 +21958,9 @@
       </w:tcPr>
     </w:tblStylePr>
   </w:style>
-  <w:style w:type="table" w:styleId="908">
+  <w:style w:type="table" w:styleId="918">
     <w:name w:val="Grid Table 7 Colorful - Accent 1"/>
-    <w:basedOn w:val="857"/>
+    <w:basedOn w:val="867"/>
     <w:uiPriority w:val="99"/>
     <w:pPr>
       <w:pBdr/>
@@ -22204,9 +22212,9 @@
       </w:tcPr>
     </w:tblStylePr>
   </w:style>
-  <w:style w:type="table" w:styleId="909">
+  <w:style w:type="table" w:styleId="919">
     <w:name w:val="Grid Table 7 Colorful - Accent 2"/>
-    <w:basedOn w:val="857"/>
+    <w:basedOn w:val="867"/>
     <w:uiPriority w:val="99"/>
     <w:pPr>
       <w:pBdr/>
@@ -22458,9 +22466,9 @@
       </w:tcPr>
     </w:tblStylePr>
   </w:style>
-  <w:style w:type="table" w:styleId="910">
+  <w:style w:type="table" w:styleId="920">
     <w:name w:val="Grid Table 7 Colorful - Accent 3"/>
-    <w:basedOn w:val="857"/>
+    <w:basedOn w:val="867"/>
     <w:uiPriority w:val="99"/>
     <w:pPr>
       <w:pBdr/>
@@ -22712,9 +22720,9 @@
       </w:tcPr>
     </w:tblStylePr>
   </w:style>
-  <w:style w:type="table" w:styleId="911">
+  <w:style w:type="table" w:styleId="921">
     <w:name w:val="Grid Table 7 Colorful - Accent 4"/>
-    <w:basedOn w:val="857"/>
+    <w:basedOn w:val="867"/>
     <w:uiPriority w:val="99"/>
     <w:pPr>
       <w:pBdr/>
@@ -22966,9 +22974,9 @@
       </w:tcPr>
     </w:tblStylePr>
   </w:style>
-  <w:style w:type="table" w:styleId="912">
+  <w:style w:type="table" w:styleId="922">
     <w:name w:val="Grid Table 7 Colorful - Accent 5"/>
-    <w:basedOn w:val="857"/>
+    <w:basedOn w:val="867"/>
     <w:uiPriority w:val="99"/>
     <w:pPr>
       <w:pBdr/>
@@ -23220,9 +23228,9 @@
       </w:tcPr>
     </w:tblStylePr>
   </w:style>
-  <w:style w:type="table" w:styleId="913">
+  <w:style w:type="table" w:styleId="923">
     <w:name w:val="Grid Table 7 Colorful - Accent 6"/>
-    <w:basedOn w:val="857"/>
+    <w:basedOn w:val="867"/>
     <w:uiPriority w:val="99"/>
     <w:pPr>
       <w:pBdr/>
@@ -23474,9 +23482,9 @@
       </w:tcPr>
     </w:tblStylePr>
   </w:style>
-  <w:style w:type="table" w:styleId="914">
+  <w:style w:type="table" w:styleId="924">
     <w:name w:val="List Table 1 Light"/>
-    <w:basedOn w:val="857"/>
+    <w:basedOn w:val="867"/>
     <w:uiPriority w:val="99"/>
     <w:pPr>
       <w:pBdr/>
@@ -23690,9 +23698,9 @@
       </w:tcPr>
     </w:tblStylePr>
   </w:style>
-  <w:style w:type="table" w:styleId="915">
+  <w:style w:type="table" w:styleId="925">
     <w:name w:val="List Table 1 Light - Accent 1"/>
-    <w:basedOn w:val="857"/>
+    <w:basedOn w:val="867"/>
     <w:uiPriority w:val="99"/>
     <w:pPr>
       <w:pBdr/>
@@ -23906,9 +23914,9 @@
       </w:tcPr>
     </w:tblStylePr>
   </w:style>
-  <w:style w:type="table" w:styleId="916">
+  <w:style w:type="table" w:styleId="926">
     <w:name w:val="List Table 1 Light - Accent 2"/>
-    <w:basedOn w:val="857"/>
+    <w:basedOn w:val="867"/>
     <w:uiPriority w:val="99"/>
     <w:pPr>
       <w:pBdr/>
@@ -24122,9 +24130,9 @@
       </w:tcPr>
     </w:tblStylePr>
   </w:style>
-  <w:style w:type="table" w:styleId="917">
+  <w:style w:type="table" w:styleId="927">
     <w:name w:val="List Table 1 Light - Accent 3"/>
-    <w:basedOn w:val="857"/>
+    <w:basedOn w:val="867"/>
     <w:uiPriority w:val="99"/>
     <w:pPr>
       <w:pBdr/>
@@ -24338,9 +24346,9 @@
       </w:tcPr>
     </w:tblStylePr>
   </w:style>
-  <w:style w:type="table" w:styleId="918">
+  <w:style w:type="table" w:styleId="928">
     <w:name w:val="List Table 1 Light - Accent 4"/>
-    <w:basedOn w:val="857"/>
+    <w:basedOn w:val="867"/>
     <w:uiPriority w:val="99"/>
     <w:pPr>
       <w:pBdr/>
@@ -24554,9 +24562,9 @@
       </w:tcPr>
     </w:tblStylePr>
   </w:style>
-  <w:style w:type="table" w:styleId="919">
+  <w:style w:type="table" w:styleId="929">
     <w:name w:val="List Table 1 Light - Accent 5"/>
-    <w:basedOn w:val="857"/>
+    <w:basedOn w:val="867"/>
     <w:uiPriority w:val="99"/>
     <w:pPr>
       <w:pBdr/>
@@ -24770,9 +24778,9 @@
       </w:tcPr>
     </w:tblStylePr>
   </w:style>
-  <w:style w:type="table" w:styleId="920">
+  <w:style w:type="table" w:styleId="930">
     <w:name w:val="List Table 1 Light - Accent 6"/>
-    <w:basedOn w:val="857"/>
+    <w:basedOn w:val="867"/>
     <w:uiPriority w:val="99"/>
     <w:pPr>
       <w:pBdr/>
@@ -24986,9 +24994,9 @@
       </w:tcPr>
     </w:tblStylePr>
   </w:style>
-  <w:style w:type="table" w:styleId="921">
+  <w:style w:type="table" w:styleId="931">
     <w:name w:val="List Table 2"/>
-    <w:basedOn w:val="857"/>
+    <w:basedOn w:val="867"/>
     <w:uiPriority w:val="99"/>
     <w:pPr>
       <w:pBdr/>
@@ -25224,9 +25232,9 @@
       </w:tcPr>
     </w:tblStylePr>
   </w:style>
-  <w:style w:type="table" w:styleId="922">
+  <w:style w:type="table" w:styleId="932">
     <w:name w:val="List Table 2 - Accent 1"/>
-    <w:basedOn w:val="857"/>
+    <w:basedOn w:val="867"/>
     <w:uiPriority w:val="99"/>
     <w:pPr>
       <w:pBdr/>
@@ -25462,9 +25470,9 @@
       </w:tcPr>
     </w:tblStylePr>
   </w:style>
-  <w:style w:type="table" w:styleId="923">
+  <w:style w:type="table" w:styleId="933">
     <w:name w:val="List Table 2 - Accent 2"/>
-    <w:basedOn w:val="857"/>
+    <w:basedOn w:val="867"/>
     <w:uiPriority w:val="99"/>
     <w:pPr>
       <w:pBdr/>
@@ -25700,9 +25708,9 @@
       </w:tcPr>
     </w:tblStylePr>
   </w:style>
-  <w:style w:type="table" w:styleId="924">
+  <w:style w:type="table" w:styleId="934">
     <w:name w:val="List Table 2 - Accent 3"/>
-    <w:basedOn w:val="857"/>
+    <w:basedOn w:val="867"/>
     <w:uiPriority w:val="99"/>
     <w:pPr>
       <w:pBdr/>
@@ -25938,9 +25946,9 @@
       </w:tcPr>
     </w:tblStylePr>
   </w:style>
-  <w:style w:type="table" w:styleId="925">
+  <w:style w:type="table" w:styleId="935">
     <w:name w:val="List Table 2 - Accent 4"/>
-    <w:basedOn w:val="857"/>
+    <w:basedOn w:val="867"/>
     <w:uiPriority w:val="99"/>
     <w:pPr>
       <w:pBdr/>
@@ -26176,9 +26184,9 @@
       </w:tcPr>
     </w:tblStylePr>
   </w:style>
-  <w:style w:type="table" w:styleId="926">
+  <w:style w:type="table" w:styleId="936">
     <w:name w:val="List Table 2 - Accent 5"/>
-    <w:basedOn w:val="857"/>
+    <w:basedOn w:val="867"/>
     <w:uiPriority w:val="99"/>
     <w:pPr>
       <w:pBdr/>
@@ -26414,9 +26422,9 @@
       </w:tcPr>
     </w:tblStylePr>
   </w:style>
-  <w:style w:type="table" w:styleId="927">
+  <w:style w:type="table" w:styleId="937">
     <w:name w:val="List Table 2 - Accent 6"/>
-    <w:basedOn w:val="857"/>
+    <w:basedOn w:val="867"/>
     <w:uiPriority w:val="99"/>
     <w:pPr>
       <w:pBdr/>
@@ -26652,9 +26660,9 @@
       </w:tcPr>
     </w:tblStylePr>
   </w:style>
-  <w:style w:type="table" w:styleId="928">
+  <w:style w:type="table" w:styleId="938">
     <w:name w:val="List Table 3"/>
-    <w:basedOn w:val="857"/>
+    <w:basedOn w:val="867"/>
     <w:uiPriority w:val="99"/>
     <w:pPr>
       <w:pBdr/>
@@ -26880,9 +26888,9 @@
       </w:tcPr>
     </w:tblStylePr>
   </w:style>
-  <w:style w:type="table" w:styleId="929">
+  <w:style w:type="table" w:styleId="939">
     <w:name w:val="List Table 3 - Accent 1"/>
-    <w:basedOn w:val="857"/>
+    <w:basedOn w:val="867"/>
     <w:uiPriority w:val="99"/>
     <w:pPr>
       <w:pBdr/>
@@ -27108,9 +27116,9 @@
       </w:tcPr>
     </w:tblStylePr>
   </w:style>
-  <w:style w:type="table" w:styleId="930">
+  <w:style w:type="table" w:styleId="940">
     <w:name w:val="List Table 3 - Accent 2"/>
-    <w:basedOn w:val="857"/>
+    <w:basedOn w:val="867"/>
     <w:uiPriority w:val="99"/>
     <w:pPr>
       <w:pBdr/>
@@ -27336,9 +27344,9 @@
       </w:tcPr>
     </w:tblStylePr>
   </w:style>
-  <w:style w:type="table" w:styleId="931">
+  <w:style w:type="table" w:styleId="941">
     <w:name w:val="List Table 3 - Accent 3"/>
-    <w:basedOn w:val="857"/>
+    <w:basedOn w:val="867"/>
     <w:uiPriority w:val="99"/>
     <w:pPr>
       <w:pBdr/>
@@ -27564,9 +27572,9 @@
       </w:tcPr>
     </w:tblStylePr>
   </w:style>
-  <w:style w:type="table" w:styleId="932">
+  <w:style w:type="table" w:styleId="942">
     <w:name w:val="List Table 3 - Accent 4"/>
-    <w:basedOn w:val="857"/>
+    <w:basedOn w:val="867"/>
     <w:uiPriority w:val="99"/>
     <w:pPr>
       <w:pBdr/>
@@ -27792,9 +27800,9 @@
       </w:tcPr>
     </w:tblStylePr>
   </w:style>
-  <w:style w:type="table" w:styleId="933">
+  <w:style w:type="table" w:styleId="943">
     <w:name w:val="List Table 3 - Accent 5"/>
-    <w:basedOn w:val="857"/>
+    <w:basedOn w:val="867"/>
     <w:uiPriority w:val="99"/>
     <w:pPr>
       <w:pBdr/>
@@ -28020,9 +28028,9 @@
       </w:tcPr>
     </w:tblStylePr>
   </w:style>
-  <w:style w:type="table" w:styleId="934">
+  <w:style w:type="table" w:styleId="944">
     <w:name w:val="List Table 3 - Accent 6"/>
-    <w:basedOn w:val="857"/>
+    <w:basedOn w:val="867"/>
     <w:uiPriority w:val="99"/>
     <w:pPr>
       <w:pBdr/>
@@ -28248,9 +28256,9 @@
       </w:tcPr>
     </w:tblStylePr>
   </w:style>
-  <w:style w:type="table" w:styleId="935">
+  <w:style w:type="table" w:styleId="945">
     <w:name w:val="List Table 4"/>
-    <w:basedOn w:val="857"/>
+    <w:basedOn w:val="867"/>
     <w:uiPriority w:val="99"/>
     <w:pPr>
       <w:pBdr/>
@@ -28473,9 +28481,9 @@
       </w:tcPr>
     </w:tblStylePr>
   </w:style>
-  <w:style w:type="table" w:styleId="936">
+  <w:style w:type="table" w:styleId="946">
     <w:name w:val="List Table 4 - Accent 1"/>
-    <w:basedOn w:val="857"/>
+    <w:basedOn w:val="867"/>
     <w:uiPriority w:val="99"/>
     <w:pPr>
       <w:pBdr/>
@@ -28698,9 +28706,9 @@
       </w:tcPr>
     </w:tblStylePr>
   </w:style>
-  <w:style w:type="table" w:styleId="937">
+  <w:style w:type="table" w:styleId="947">
     <w:name w:val="List Table 4 - Accent 2"/>
-    <w:basedOn w:val="857"/>
+    <w:basedOn w:val="867"/>
     <w:uiPriority w:val="99"/>
     <w:pPr>
       <w:pBdr/>
@@ -28923,9 +28931,9 @@
       </w:tcPr>
     </w:tblStylePr>
   </w:style>
-  <w:style w:type="table" w:styleId="938">
+  <w:style w:type="table" w:styleId="948">
     <w:name w:val="List Table 4 - Accent 3"/>
-    <w:basedOn w:val="857"/>
+    <w:basedOn w:val="867"/>
     <w:uiPriority w:val="99"/>
     <w:pPr>
       <w:pBdr/>
@@ -29148,9 +29156,9 @@
       </w:tcPr>
     </w:tblStylePr>
   </w:style>
-  <w:style w:type="table" w:styleId="939">
+  <w:style w:type="table" w:styleId="949">
     <w:name w:val="List Table 4 - Accent 4"/>
-    <w:basedOn w:val="857"/>
+    <w:basedOn w:val="867"/>
     <w:uiPriority w:val="99"/>
     <w:pPr>
       <w:pBdr/>
@@ -29373,9 +29381,9 @@
       </w:tcPr>
     </w:tblStylePr>
   </w:style>
-  <w:style w:type="table" w:styleId="940">
+  <w:style w:type="table" w:styleId="950">
     <w:name w:val="List Table 4 - Accent 5"/>
-    <w:basedOn w:val="857"/>
+    <w:basedOn w:val="867"/>
     <w:uiPriority w:val="99"/>
     <w:pPr>
       <w:pBdr/>
@@ -29598,9 +29606,9 @@
       </w:tcPr>
     </w:tblStylePr>
   </w:style>
-  <w:style w:type="table" w:styleId="941">
+  <w:style w:type="table" w:styleId="951">
     <w:name w:val="List Table 4 - Accent 6"/>
-    <w:basedOn w:val="857"/>
+    <w:basedOn w:val="867"/>
     <w:uiPriority w:val="99"/>
     <w:pPr>
       <w:pBdr/>
@@ -29823,9 +29831,9 @@
       </w:tcPr>
     </w:tblStylePr>
   </w:style>
-  <w:style w:type="table" w:styleId="942">
+  <w:style w:type="table" w:styleId="952">
     <w:name w:val="List Table 5 Dark"/>
-    <w:basedOn w:val="857"/>
+    <w:basedOn w:val="867"/>
     <w:uiPriority w:val="99"/>
     <w:pPr>
       <w:pBdr/>
@@ -30065,9 +30073,9 @@
       </w:tcPr>
     </w:tblStylePr>
   </w:style>
-  <w:style w:type="table" w:styleId="943">
+  <w:style w:type="table" w:styleId="953">
     <w:name w:val="List Table 5 Dark - Accent 1"/>
-    <w:basedOn w:val="857"/>
+    <w:basedOn w:val="867"/>
     <w:uiPriority w:val="99"/>
     <w:pPr>
       <w:pBdr/>
@@ -30307,9 +30315,9 @@
       </w:tcPr>
     </w:tblStylePr>
   </w:style>
-  <w:style w:type="table" w:styleId="944">
+  <w:style w:type="table" w:styleId="954">
     <w:name w:val="List Table 5 Dark - Accent 2"/>
-    <w:basedOn w:val="857"/>
+    <w:basedOn w:val="867"/>
     <w:uiPriority w:val="99"/>
     <w:pPr>
       <w:pBdr/>
@@ -30549,9 +30557,9 @@
       </w:tcPr>
     </w:tblStylePr>
   </w:style>
-  <w:style w:type="table" w:styleId="945">
+  <w:style w:type="table" w:styleId="955">
     <w:name w:val="List Table 5 Dark - Accent 3"/>
-    <w:basedOn w:val="857"/>
+    <w:basedOn w:val="867"/>
     <w:uiPriority w:val="99"/>
     <w:pPr>
       <w:pBdr/>
@@ -30791,9 +30799,9 @@
       </w:tcPr>
     </w:tblStylePr>
   </w:style>
-  <w:style w:type="table" w:styleId="946">
+  <w:style w:type="table" w:styleId="956">
     <w:name w:val="List Table 5 Dark - Accent 4"/>
-    <w:basedOn w:val="857"/>
+    <w:basedOn w:val="867"/>
     <w:uiPriority w:val="99"/>
     <w:pPr>
       <w:pBdr/>
@@ -31033,9 +31041,9 @@
       </w:tcPr>
     </w:tblStylePr>
   </w:style>
-  <w:style w:type="table" w:styleId="947">
+  <w:style w:type="table" w:styleId="957">
     <w:name w:val="List Table 5 Dark - Accent 5"/>
-    <w:basedOn w:val="857"/>
+    <w:basedOn w:val="867"/>
     <w:uiPriority w:val="99"/>
     <w:pPr>
       <w:pBdr/>
@@ -31275,9 +31283,9 @@
       </w:tcPr>
     </w:tblStylePr>
   </w:style>
-  <w:style w:type="table" w:styleId="948">
+  <w:style w:type="table" w:styleId="958">
     <w:name w:val="List Table 5 Dark - Accent 6"/>
-    <w:basedOn w:val="857"/>
+    <w:basedOn w:val="867"/>
     <w:uiPriority w:val="99"/>
     <w:pPr>
       <w:pBdr/>
@@ -31517,9 +31525,9 @@
       </w:tcPr>
     </w:tblStylePr>
   </w:style>
-  <w:style w:type="table" w:styleId="949">
+  <w:style w:type="table" w:styleId="959">
     <w:name w:val="List Table 6 Colorful"/>
-    <w:basedOn w:val="857"/>
+    <w:basedOn w:val="867"/>
     <w:uiPriority w:val="99"/>
     <w:pPr>
       <w:pBdr/>
@@ -31740,9 +31748,9 @@
       </w:tcPr>
     </w:tblStylePr>
   </w:style>
-  <w:style w:type="table" w:styleId="950">
+  <w:style w:type="table" w:styleId="960">
     <w:name w:val="List Table 6 Colorful - Accent 1"/>
-    <w:basedOn w:val="857"/>
+    <w:basedOn w:val="867"/>
     <w:uiPriority w:val="99"/>
     <w:pPr>
       <w:pBdr/>
@@ -31963,9 +31971,9 @@
       </w:tcPr>
     </w:tblStylePr>
   </w:style>
-  <w:style w:type="table" w:styleId="951">
+  <w:style w:type="table" w:styleId="961">
     <w:name w:val="List Table 6 Colorful - Accent 2"/>
-    <w:basedOn w:val="857"/>
+    <w:basedOn w:val="867"/>
     <w:uiPriority w:val="99"/>
     <w:pPr>
       <w:pBdr/>
@@ -32186,9 +32194,9 @@
       </w:tcPr>
     </w:tblStylePr>
   </w:style>
-  <w:style w:type="table" w:styleId="952">
+  <w:style w:type="table" w:styleId="962">
     <w:name w:val="List Table 6 Colorful - Accent 3"/>
-    <w:basedOn w:val="857"/>
+    <w:basedOn w:val="867"/>
     <w:uiPriority w:val="99"/>
     <w:pPr>
       <w:pBdr/>
@@ -32409,9 +32417,9 @@
       </w:tcPr>
     </w:tblStylePr>
   </w:style>
-  <w:style w:type="table" w:styleId="953">
+  <w:style w:type="table" w:styleId="963">
     <w:name w:val="List Table 6 Colorful - Accent 4"/>
-    <w:basedOn w:val="857"/>
+    <w:basedOn w:val="867"/>
     <w:uiPriority w:val="99"/>
     <w:pPr>
       <w:pBdr/>
@@ -32632,9 +32640,9 @@
       </w:tcPr>
     </w:tblStylePr>
   </w:style>
-  <w:style w:type="table" w:styleId="954">
+  <w:style w:type="table" w:styleId="964">
     <w:name w:val="List Table 6 Colorful - Accent 5"/>
-    <w:basedOn w:val="857"/>
+    <w:basedOn w:val="867"/>
     <w:uiPriority w:val="99"/>
     <w:pPr>
       <w:pBdr/>
@@ -32855,9 +32863,9 @@
       </w:tcPr>
     </w:tblStylePr>
   </w:style>
-  <w:style w:type="table" w:styleId="955">
+  <w:style w:type="table" w:styleId="965">
     <w:name w:val="List Table 6 Colorful - Accent 6"/>
-    <w:basedOn w:val="857"/>
+    <w:basedOn w:val="867"/>
     <w:uiPriority w:val="99"/>
     <w:pPr>
       <w:pBdr/>
@@ -33078,9 +33086,9 @@
       </w:tcPr>
     </w:tblStylePr>
   </w:style>
-  <w:style w:type="table" w:styleId="956">
+  <w:style w:type="table" w:styleId="966">
     <w:name w:val="List Table 7 Colorful"/>
-    <w:basedOn w:val="857"/>
+    <w:basedOn w:val="867"/>
     <w:uiPriority w:val="99"/>
     <w:pPr>
       <w:pBdr/>
@@ -33334,9 +33342,9 @@
       </w:tcPr>
     </w:tblStylePr>
   </w:style>
-  <w:style w:type="table" w:styleId="957">
+  <w:style w:type="table" w:styleId="967">
     <w:name w:val="List Table 7 Colorful - Accent 1"/>
-    <w:basedOn w:val="857"/>
+    <w:basedOn w:val="867"/>
     <w:uiPriority w:val="99"/>
     <w:pPr>
       <w:pBdr/>
@@ -33590,9 +33598,9 @@
       </w:tcPr>
     </w:tblStylePr>
   </w:style>
-  <w:style w:type="table" w:styleId="958">
+  <w:style w:type="table" w:styleId="968">
     <w:name w:val="List Table 7 Colorful - Accent 2"/>
-    <w:basedOn w:val="857"/>
+    <w:basedOn w:val="867"/>
     <w:uiPriority w:val="99"/>
     <w:pPr>
       <w:pBdr/>
@@ -33846,9 +33854,9 @@
       </w:tcPr>
     </w:tblStylePr>
   </w:style>
-  <w:style w:type="table" w:styleId="959">
+  <w:style w:type="table" w:styleId="969">
     <w:name w:val="List Table 7 Colorful - Accent 3"/>
-    <w:basedOn w:val="857"/>
+    <w:basedOn w:val="867"/>
     <w:uiPriority w:val="99"/>
     <w:pPr>
       <w:pBdr/>
@@ -34102,9 +34110,9 @@
       </w:tcPr>
     </w:tblStylePr>
   </w:style>
-  <w:style w:type="table" w:styleId="960">
+  <w:style w:type="table" w:styleId="970">
     <w:name w:val="List Table 7 Colorful - Accent 4"/>
-    <w:basedOn w:val="857"/>
+    <w:basedOn w:val="867"/>
     <w:uiPriority w:val="99"/>
     <w:pPr>
       <w:pBdr/>
@@ -34358,9 +34366,9 @@
       </w:tcPr>
     </w:tblStylePr>
   </w:style>
-  <w:style w:type="table" w:styleId="961">
+  <w:style w:type="table" w:styleId="971">
     <w:name w:val="List Table 7 Colorful - Accent 5"/>
-    <w:basedOn w:val="857"/>
+    <w:basedOn w:val="867"/>
     <w:uiPriority w:val="99"/>
     <w:pPr>
       <w:pBdr/>
@@ -34614,9 +34622,9 @@
       </w:tcPr>
     </w:tblStylePr>
   </w:style>
-  <w:style w:type="table" w:styleId="962">
+  <w:style w:type="table" w:styleId="972">
     <w:name w:val="List Table 7 Colorful - Accent 6"/>
-    <w:basedOn w:val="857"/>
+    <w:basedOn w:val="867"/>
     <w:uiPriority w:val="99"/>
     <w:pPr>
       <w:pBdr/>
@@ -34870,9 +34878,9 @@
       </w:tcPr>
     </w:tblStylePr>
   </w:style>
-  <w:style w:type="table" w:styleId="963">
+  <w:style w:type="table" w:styleId="973">
     <w:name w:val="Lined - Accent"/>
-    <w:basedOn w:val="857"/>
+    <w:basedOn w:val="867"/>
     <w:uiPriority w:val="99"/>
     <w:pPr>
       <w:pBdr/>
@@ -35107,9 +35115,9 @@
       </w:tcPr>
     </w:tblStylePr>
   </w:style>
-  <w:style w:type="table" w:styleId="964">
+  <w:style w:type="table" w:styleId="974">
     <w:name w:val="Lined - Accent 1"/>
-    <w:basedOn w:val="857"/>
+    <w:basedOn w:val="867"/>
     <w:uiPriority w:val="99"/>
     <w:pPr>
       <w:pBdr/>
@@ -35344,9 +35352,9 @@
       </w:tcPr>
     </w:tblStylePr>
   </w:style>
-  <w:style w:type="table" w:styleId="965">
+  <w:style w:type="table" w:styleId="975">
     <w:name w:val="Lined - Accent 2"/>
-    <w:basedOn w:val="857"/>
+    <w:basedOn w:val="867"/>
     <w:uiPriority w:val="99"/>
     <w:pPr>
       <w:pBdr/>
@@ -35581,9 +35589,9 @@
       </w:tcPr>
     </w:tblStylePr>
   </w:style>
-  <w:style w:type="table" w:styleId="966">
+  <w:style w:type="table" w:styleId="976">
     <w:name w:val="Lined - Accent 3"/>
-    <w:basedOn w:val="857"/>
+    <w:basedOn w:val="867"/>
     <w:uiPriority w:val="99"/>
     <w:pPr>
       <w:pBdr/>
@@ -35818,9 +35826,9 @@
       </w:tcPr>
     </w:tblStylePr>
   </w:style>
-  <w:style w:type="table" w:styleId="967">
+  <w:style w:type="table" w:styleId="977">
     <w:name w:val="Lined - Accent 4"/>
-    <w:basedOn w:val="857"/>
+    <w:basedOn w:val="867"/>
     <w:uiPriority w:val="99"/>
     <w:pPr>
       <w:pBdr/>
@@ -36055,9 +36063,9 @@
       </w:tcPr>
     </w:tblStylePr>
   </w:style>
-  <w:style w:type="table" w:styleId="968">
+  <w:style w:type="table" w:styleId="978">
     <w:name w:val="Lined - Accent 5"/>
-    <w:basedOn w:val="857"/>
+    <w:basedOn w:val="867"/>
     <w:uiPriority w:val="99"/>
     <w:pPr>
       <w:pBdr/>
@@ -36292,9 +36300,9 @@
       </w:tcPr>
     </w:tblStylePr>
   </w:style>
-  <w:style w:type="table" w:styleId="969">
+  <w:style w:type="table" w:styleId="979">
     <w:name w:val="Lined - Accent 6"/>
-    <w:basedOn w:val="857"/>
+    <w:basedOn w:val="867"/>
     <w:uiPriority w:val="99"/>
     <w:pPr>
       <w:pBdr/>
@@ -36529,9 +36537,9 @@
       </w:tcPr>
     </w:tblStylePr>
   </w:style>
-  <w:style w:type="table" w:styleId="970">
+  <w:style w:type="table" w:styleId="980">
     <w:name w:val="Bordered &amp; Lined - Accent"/>
-    <w:basedOn w:val="857"/>
+    <w:basedOn w:val="867"/>
     <w:uiPriority w:val="99"/>
     <w:pPr>
       <w:pBdr/>
@@ -36773,9 +36781,9 @@
       </w:tcPr>
     </w:tblStylePr>
   </w:style>
-  <w:style w:type="table" w:styleId="971">
+  <w:style w:type="table" w:styleId="981">
     <w:name w:val="Bordered &amp; Lined - Accent 1"/>
-    <w:basedOn w:val="857"/>
+    <w:basedOn w:val="867"/>
     <w:uiPriority w:val="99"/>
     <w:pPr>
       <w:pBdr/>
@@ -37017,9 +37025,9 @@
       </w:tcPr>
     </w:tblStylePr>
   </w:style>
-  <w:style w:type="table" w:styleId="972">
+  <w:style w:type="table" w:styleId="982">
     <w:name w:val="Bordered &amp; Lined - Accent 2"/>
-    <w:basedOn w:val="857"/>
+    <w:basedOn w:val="867"/>
     <w:uiPriority w:val="99"/>
     <w:pPr>
       <w:pBdr/>
@@ -37261,9 +37269,9 @@
       </w:tcPr>
     </w:tblStylePr>
   </w:style>
-  <w:style w:type="table" w:styleId="973">
+  <w:style w:type="table" w:styleId="983">
     <w:name w:val="Bordered &amp; Lined - Accent 3"/>
-    <w:basedOn w:val="857"/>
+    <w:basedOn w:val="867"/>
     <w:uiPriority w:val="99"/>
     <w:pPr>
       <w:pBdr/>
@@ -37505,9 +37513,9 @@
       </w:tcPr>
     </w:tblStylePr>
   </w:style>
-  <w:style w:type="table" w:styleId="974">
+  <w:style w:type="table" w:styleId="984">
     <w:name w:val="Bordered &amp; Lined - Accent 4"/>
-    <w:basedOn w:val="857"/>
+    <w:basedOn w:val="867"/>
     <w:uiPriority w:val="99"/>
     <w:pPr>
       <w:pBdr/>
@@ -37749,9 +37757,9 @@
       </w:tcPr>
     </w:tblStylePr>
   </w:style>
-  <w:style w:type="table" w:styleId="975">
+  <w:style w:type="table" w:styleId="985">
     <w:name w:val="Bordered &amp; Lined - Accent 5"/>
-    <w:basedOn w:val="857"/>
+    <w:basedOn w:val="867"/>
     <w:uiPriority w:val="99"/>
     <w:pPr>
       <w:pBdr/>
@@ -37993,9 +38001,9 @@
       </w:tcPr>
     </w:tblStylePr>
   </w:style>
-  <w:style w:type="table" w:styleId="976">
+  <w:style w:type="table" w:styleId="986">
     <w:name w:val="Bordered &amp; Lined - Accent 6"/>
-    <w:basedOn w:val="857"/>
+    <w:basedOn w:val="867"/>
     <w:uiPriority w:val="99"/>
     <w:pPr>
       <w:pBdr/>
@@ -38237,9 +38245,9 @@
       </w:tcPr>
     </w:tblStylePr>
   </w:style>
-  <w:style w:type="table" w:styleId="977">
+  <w:style w:type="table" w:styleId="987">
     <w:name w:val="Bordered"/>
-    <w:basedOn w:val="857"/>
+    <w:basedOn w:val="867"/>
     <w:uiPriority w:val="99"/>
     <w:pPr>
       <w:pBdr/>
@@ -38468,9 +38476,9 @@
       </w:tcPr>
     </w:tblStylePr>
   </w:style>
-  <w:style w:type="table" w:styleId="978">
+  <w:style w:type="table" w:styleId="988">
     <w:name w:val="Bordered - Accent 1"/>
-    <w:basedOn w:val="857"/>
+    <w:basedOn w:val="867"/>
     <w:uiPriority w:val="99"/>
     <w:pPr>
       <w:pBdr/>
@@ -38699,9 +38707,9 @@
       </w:tcPr>
     </w:tblStylePr>
   </w:style>
-  <w:style w:type="table" w:styleId="979">
+  <w:style w:type="table" w:styleId="989">
     <w:name w:val="Bordered - Accent 2"/>
-    <w:basedOn w:val="857"/>
+    <w:basedOn w:val="867"/>
     <w:uiPriority w:val="99"/>
     <w:pPr>
       <w:pBdr/>
@@ -38930,9 +38938,9 @@
       </w:tcPr>
     </w:tblStylePr>
   </w:style>
-  <w:style w:type="table" w:styleId="980">
+  <w:style w:type="table" w:styleId="990">
     <w:name w:val="Bordered - Accent 3"/>
-    <w:basedOn w:val="857"/>
+    <w:basedOn w:val="867"/>
     <w:uiPriority w:val="99"/>
     <w:pPr>
       <w:pBdr/>
@@ -39161,9 +39169,9 @@
       </w:tcPr>
     </w:tblStylePr>
   </w:style>
-  <w:style w:type="table" w:styleId="981">
+  <w:style w:type="table" w:styleId="991">
     <w:name w:val="Bordered - Accent 4"/>
-    <w:basedOn w:val="857"/>
+    <w:basedOn w:val="867"/>
     <w:uiPriority w:val="99"/>
     <w:pPr>
       <w:pBdr/>
@@ -39392,9 +39400,9 @@
       </w:tcPr>
     </w:tblStylePr>
   </w:style>
-  <w:style w:type="table" w:styleId="982">
+  <w:style w:type="table" w:styleId="992">
     <w:name w:val="Bordered - Accent 5"/>
-    <w:basedOn w:val="857"/>
+    <w:basedOn w:val="867"/>
     <w:uiPriority w:val="99"/>
     <w:pPr>
       <w:pBdr/>
@@ -39623,9 +39631,9 @@
       </w:tcPr>
     </w:tblStylePr>
   </w:style>
-  <w:style w:type="table" w:styleId="983">
+  <w:style w:type="table" w:styleId="993">
     <w:name w:val="Bordered - Accent 6"/>
-    <w:basedOn w:val="857"/>
+    <w:basedOn w:val="867"/>
     <w:uiPriority w:val="99"/>
     <w:pPr>
       <w:pBdr/>
@@ -39854,11 +39862,11 @@
       </w:tcPr>
     </w:tblStylePr>
   </w:style>
-  <w:style w:type="paragraph" w:styleId="984">
+  <w:style w:type="paragraph" w:styleId="994">
     <w:name w:val="Heading 3"/>
-    <w:basedOn w:val="1044"/>
-    <w:next w:val="1044"/>
-    <w:link w:val="993"/>
+    <w:basedOn w:val="1054"/>
+    <w:next w:val="1054"/>
+    <w:link w:val="1003"/>
     <w:uiPriority w:val="9"/>
     <w:unhideWhenUsed/>
     <w:qFormat/>
@@ -39877,11 +39885,11 @@
       <w:szCs w:val="28"/>
     </w:rPr>
   </w:style>
-  <w:style w:type="paragraph" w:styleId="985">
+  <w:style w:type="paragraph" w:styleId="995">
     <w:name w:val="Heading 4"/>
-    <w:basedOn w:val="1044"/>
-    <w:next w:val="1044"/>
-    <w:link w:val="994"/>
+    <w:basedOn w:val="1054"/>
+    <w:next w:val="1054"/>
+    <w:link w:val="1004"/>
     <w:uiPriority w:val="9"/>
     <w:unhideWhenUsed/>
     <w:qFormat/>
@@ -39900,11 +39908,11 @@
       <w:color w:val="0f4761" w:themeColor="accent1" w:themeShade="BF"/>
     </w:rPr>
   </w:style>
-  <w:style w:type="paragraph" w:styleId="986">
+  <w:style w:type="paragraph" w:styleId="996">
     <w:name w:val="Heading 5"/>
-    <w:basedOn w:val="1044"/>
-    <w:next w:val="1044"/>
-    <w:link w:val="995"/>
+    <w:basedOn w:val="1054"/>
+    <w:next w:val="1054"/>
+    <w:link w:val="1005"/>
     <w:uiPriority w:val="9"/>
     <w:unhideWhenUsed/>
     <w:qFormat/>
@@ -39921,11 +39929,11 @@
       <w:color w:val="0f4761" w:themeColor="accent1" w:themeShade="BF"/>
     </w:rPr>
   </w:style>
-  <w:style w:type="paragraph" w:styleId="987">
+  <w:style w:type="paragraph" w:styleId="997">
     <w:name w:val="Heading 6"/>
-    <w:basedOn w:val="1044"/>
-    <w:next w:val="1044"/>
-    <w:link w:val="996"/>
+    <w:basedOn w:val="1054"/>
+    <w:next w:val="1054"/>
+    <w:link w:val="1006"/>
     <w:uiPriority w:val="9"/>
     <w:unhideWhenUsed/>
     <w:qFormat/>
@@ -39944,11 +39952,11 @@
       <w:color w:val="595959" w:themeColor="text1" w:themeTint="A6"/>
     </w:rPr>
   </w:style>
-  <w:style w:type="paragraph" w:styleId="988">
+  <w:style w:type="paragraph" w:styleId="998">
     <w:name w:val="Heading 7"/>
-    <w:basedOn w:val="1044"/>
-    <w:next w:val="1044"/>
-    <w:link w:val="997"/>
+    <w:basedOn w:val="1054"/>
+    <w:next w:val="1054"/>
+    <w:link w:val="1007"/>
     <w:uiPriority w:val="9"/>
     <w:unhideWhenUsed/>
     <w:qFormat/>
@@ -39965,11 +39973,11 @@
       <w:color w:val="595959" w:themeColor="text1" w:themeTint="A6"/>
     </w:rPr>
   </w:style>
-  <w:style w:type="paragraph" w:styleId="989">
+  <w:style w:type="paragraph" w:styleId="999">
     <w:name w:val="Heading 8"/>
-    <w:basedOn w:val="1044"/>
-    <w:next w:val="1044"/>
-    <w:link w:val="998"/>
+    <w:basedOn w:val="1054"/>
+    <w:next w:val="1054"/>
+    <w:link w:val="1008"/>
     <w:uiPriority w:val="9"/>
     <w:unhideWhenUsed/>
     <w:qFormat/>
@@ -39988,11 +39996,11 @@
       <w:color w:val="272727" w:themeColor="text1" w:themeTint="D8"/>
     </w:rPr>
   </w:style>
-  <w:style w:type="paragraph" w:styleId="990">
+  <w:style w:type="paragraph" w:styleId="1000">
     <w:name w:val="Heading 9"/>
-    <w:basedOn w:val="1044"/>
-    <w:next w:val="1044"/>
-    <w:link w:val="999"/>
+    <w:basedOn w:val="1054"/>
+    <w:next w:val="1054"/>
+    <w:link w:val="1009"/>
     <w:uiPriority w:val="9"/>
     <w:unhideWhenUsed/>
     <w:qFormat/>
@@ -40011,10 +40019,10 @@
       <w:color w:val="272727" w:themeColor="text1" w:themeTint="D8"/>
     </w:rPr>
   </w:style>
-  <w:style w:type="character" w:styleId="991">
+  <w:style w:type="character" w:styleId="1001">
     <w:name w:val="Heading 1 Char"/>
-    <w:basedOn w:val="1041"/>
-    <w:link w:val="1046"/>
+    <w:basedOn w:val="1051"/>
+    <w:link w:val="1056"/>
     <w:uiPriority w:val="9"/>
     <w:pPr>
       <w:pBdr/>
@@ -40028,10 +40036,10 @@
       <w:szCs w:val="40"/>
     </w:rPr>
   </w:style>
-  <w:style w:type="character" w:styleId="992">
+  <w:style w:type="character" w:styleId="1002">
     <w:name w:val="Heading 2 Char"/>
-    <w:basedOn w:val="1041"/>
-    <w:link w:val="1047"/>
+    <w:basedOn w:val="1051"/>
+    <w:link w:val="1057"/>
     <w:uiPriority w:val="9"/>
     <w:pPr>
       <w:pBdr/>
@@ -40045,10 +40053,10 @@
       <w:szCs w:val="32"/>
     </w:rPr>
   </w:style>
-  <w:style w:type="character" w:styleId="993">
+  <w:style w:type="character" w:styleId="1003">
     <w:name w:val="Heading 3 Char"/>
-    <w:basedOn w:val="1041"/>
-    <w:link w:val="984"/>
+    <w:basedOn w:val="1051"/>
+    <w:link w:val="994"/>
     <w:uiPriority w:val="9"/>
     <w:pPr>
       <w:pBdr/>
@@ -40062,10 +40070,10 @@
       <w:szCs w:val="28"/>
     </w:rPr>
   </w:style>
-  <w:style w:type="character" w:styleId="994">
+  <w:style w:type="character" w:styleId="1004">
     <w:name w:val="Heading 4 Char"/>
-    <w:basedOn w:val="1041"/>
-    <w:link w:val="985"/>
+    <w:basedOn w:val="1051"/>
+    <w:link w:val="995"/>
     <w:uiPriority w:val="9"/>
     <w:pPr>
       <w:pBdr/>
@@ -40079,10 +40087,10 @@
       <w:color w:val="0f4761" w:themeColor="accent1" w:themeShade="BF"/>
     </w:rPr>
   </w:style>
-  <w:style w:type="character" w:styleId="995">
+  <w:style w:type="character" w:styleId="1005">
     <w:name w:val="Heading 5 Char"/>
-    <w:basedOn w:val="1041"/>
-    <w:link w:val="986"/>
+    <w:basedOn w:val="1051"/>
+    <w:link w:val="996"/>
     <w:uiPriority w:val="9"/>
     <w:pPr>
       <w:pBdr/>
@@ -40094,10 +40102,10 @@
       <w:color w:val="0f4761" w:themeColor="accent1" w:themeShade="BF"/>
     </w:rPr>
   </w:style>
-  <w:style w:type="character" w:styleId="996">
+  <w:style w:type="character" w:styleId="1006">
     <w:name w:val="Heading 6 Char"/>
-    <w:basedOn w:val="1041"/>
-    <w:link w:val="987"/>
+    <w:basedOn w:val="1051"/>
+    <w:link w:val="997"/>
     <w:uiPriority w:val="9"/>
     <w:pPr>
       <w:pBdr/>
@@ -40111,10 +40119,10 @@
       <w:color w:val="595959" w:themeColor="text1" w:themeTint="A6"/>
     </w:rPr>
   </w:style>
-  <w:style w:type="character" w:styleId="997">
+  <w:style w:type="character" w:styleId="1007">
     <w:name w:val="Heading 7 Char"/>
-    <w:basedOn w:val="1041"/>
-    <w:link w:val="988"/>
+    <w:basedOn w:val="1051"/>
+    <w:link w:val="998"/>
     <w:uiPriority w:val="9"/>
     <w:pPr>
       <w:pBdr/>
@@ -40126,10 +40134,10 @@
       <w:color w:val="595959" w:themeColor="text1" w:themeTint="A6"/>
     </w:rPr>
   </w:style>
-  <w:style w:type="character" w:styleId="998">
+  <w:style w:type="character" w:styleId="1008">
     <w:name w:val="Heading 8 Char"/>
-    <w:basedOn w:val="1041"/>
-    <w:link w:val="989"/>
+    <w:basedOn w:val="1051"/>
+    <w:link w:val="999"/>
     <w:uiPriority w:val="9"/>
     <w:pPr>
       <w:pBdr/>
@@ -40143,10 +40151,10 @@
       <w:color w:val="272727" w:themeColor="text1" w:themeTint="D8"/>
     </w:rPr>
   </w:style>
-  <w:style w:type="character" w:styleId="999">
+  <w:style w:type="character" w:styleId="1009">
     <w:name w:val="Heading 9 Char"/>
-    <w:basedOn w:val="1041"/>
-    <w:link w:val="990"/>
+    <w:basedOn w:val="1051"/>
+    <w:link w:val="1000"/>
     <w:uiPriority w:val="9"/>
     <w:pPr>
       <w:pBdr/>
@@ -40160,11 +40168,11 @@
       <w:color w:val="272727" w:themeColor="text1" w:themeTint="D8"/>
     </w:rPr>
   </w:style>
-  <w:style w:type="paragraph" w:styleId="1000">
+  <w:style w:type="paragraph" w:styleId="1010">
     <w:name w:val="Title"/>
-    <w:basedOn w:val="1044"/>
-    <w:next w:val="1044"/>
-    <w:link w:val="1001"/>
+    <w:basedOn w:val="1054"/>
+    <w:next w:val="1054"/>
+    <w:link w:val="1011"/>
     <w:uiPriority w:val="10"/>
     <w:qFormat/>
     <w:pPr>
@@ -40180,10 +40188,10 @@
       <w:szCs w:val="56"/>
     </w:rPr>
   </w:style>
-  <w:style w:type="character" w:styleId="1001">
+  <w:style w:type="character" w:styleId="1011">
     <w:name w:val="Title Char"/>
-    <w:basedOn w:val="1041"/>
-    <w:link w:val="1000"/>
+    <w:basedOn w:val="1051"/>
+    <w:link w:val="1010"/>
     <w:uiPriority w:val="10"/>
     <w:pPr>
       <w:pBdr/>
@@ -40197,11 +40205,11 @@
       <w:szCs w:val="56"/>
     </w:rPr>
   </w:style>
-  <w:style w:type="paragraph" w:styleId="1002">
+  <w:style w:type="paragraph" w:styleId="1012">
     <w:name w:val="Subtitle"/>
-    <w:basedOn w:val="1044"/>
-    <w:next w:val="1044"/>
-    <w:link w:val="1003"/>
+    <w:basedOn w:val="1054"/>
+    <w:next w:val="1054"/>
+    <w:link w:val="1013"/>
     <w:uiPriority w:val="11"/>
     <w:qFormat/>
     <w:pPr>
@@ -40219,10 +40227,10 @@
       <w:szCs w:val="28"/>
     </w:rPr>
   </w:style>
-  <w:style w:type="character" w:styleId="1003">
+  <w:style w:type="character" w:styleId="1013">
     <w:name w:val="Subtitle Char"/>
-    <w:basedOn w:val="1041"/>
-    <w:link w:val="1002"/>
+    <w:basedOn w:val="1051"/>
+    <w:link w:val="1012"/>
     <w:uiPriority w:val="11"/>
     <w:pPr>
       <w:pBdr/>
@@ -40236,11 +40244,11 @@
       <w:szCs w:val="28"/>
     </w:rPr>
   </w:style>
-  <w:style w:type="paragraph" w:styleId="1004">
+  <w:style w:type="paragraph" w:styleId="1014">
     <w:name w:val="Quote"/>
-    <w:basedOn w:val="1044"/>
-    <w:next w:val="1044"/>
-    <w:link w:val="1005"/>
+    <w:basedOn w:val="1054"/>
+    <w:next w:val="1054"/>
+    <w:link w:val="1015"/>
     <w:uiPriority w:val="29"/>
     <w:qFormat/>
     <w:pPr>
@@ -40255,10 +40263,10 @@
       <w:color w:val="404040" w:themeColor="text1" w:themeTint="BF"/>
     </w:rPr>
   </w:style>
-  <w:style w:type="character" w:styleId="1005">
+  <w:style w:type="character" w:styleId="1015">
     <w:name w:val="Quote Char"/>
-    <w:basedOn w:val="1041"/>
-    <w:link w:val="1004"/>
+    <w:basedOn w:val="1051"/>
+    <w:link w:val="1014"/>
     <w:uiPriority w:val="29"/>
     <w:pPr>
       <w:pBdr/>
@@ -40271,9 +40279,9 @@
       <w:color w:val="404040" w:themeColor="text1" w:themeTint="BF"/>
     </w:rPr>
   </w:style>
-  <w:style w:type="character" w:styleId="1006">
+  <w:style w:type="character" w:styleId="1016">
     <w:name w:val="Intense Emphasis"/>
-    <w:basedOn w:val="1041"/>
+    <w:basedOn w:val="1051"/>
     <w:uiPriority w:val="21"/>
     <w:qFormat/>
     <w:pPr>
@@ -40287,11 +40295,11 @@
       <w:color w:val="0f4761" w:themeColor="accent1" w:themeShade="BF"/>
     </w:rPr>
   </w:style>
-  <w:style w:type="paragraph" w:styleId="1007">
+  <w:style w:type="paragraph" w:styleId="1017">
     <w:name w:val="Intense Quote"/>
-    <w:basedOn w:val="1044"/>
-    <w:next w:val="1044"/>
-    <w:link w:val="1008"/>
+    <w:basedOn w:val="1054"/>
+    <w:next w:val="1054"/>
+    <w:link w:val="1018"/>
     <w:uiPriority w:val="30"/>
     <w:qFormat/>
     <w:pPr>
@@ -40309,10 +40317,10 @@
       <w:color w:val="0f4761" w:themeColor="accent1" w:themeShade="BF"/>
     </w:rPr>
   </w:style>
-  <w:style w:type="character" w:styleId="1008">
+  <w:style w:type="character" w:styleId="1018">
     <w:name w:val="Intense Quote Char"/>
-    <w:basedOn w:val="1041"/>
-    <w:link w:val="1007"/>
+    <w:basedOn w:val="1051"/>
+    <w:link w:val="1017"/>
     <w:uiPriority w:val="30"/>
     <w:pPr>
       <w:pBdr/>
@@ -40325,9 +40333,9 @@
       <w:color w:val="0f4761" w:themeColor="accent1" w:themeShade="BF"/>
     </w:rPr>
   </w:style>
-  <w:style w:type="character" w:styleId="1009">
+  <w:style w:type="character" w:styleId="1019">
     <w:name w:val="Intense Reference"/>
-    <w:basedOn w:val="1041"/>
+    <w:basedOn w:val="1051"/>
     <w:uiPriority w:val="32"/>
     <w:qFormat/>
     <w:pPr>
@@ -40343,9 +40351,9 @@
       <w:spacing w:val="5"/>
     </w:rPr>
   </w:style>
-  <w:style w:type="paragraph" w:styleId="1010">
+  <w:style w:type="paragraph" w:styleId="1020">
     <w:name w:val="No Spacing"/>
-    <w:basedOn w:val="1044"/>
+    <w:basedOn w:val="1054"/>
     <w:uiPriority w:val="1"/>
     <w:qFormat/>
     <w:pPr>
@@ -40354,9 +40362,9 @@
       <w:ind/>
     </w:pPr>
   </w:style>
-  <w:style w:type="character" w:styleId="1011">
+  <w:style w:type="character" w:styleId="1021">
     <w:name w:val="Subtle Emphasis"/>
-    <w:basedOn w:val="1041"/>
+    <w:basedOn w:val="1051"/>
     <w:uiPriority w:val="19"/>
     <w:qFormat/>
     <w:pPr>
@@ -40370,9 +40378,9 @@
       <w:color w:val="404040" w:themeColor="text1" w:themeTint="BF"/>
     </w:rPr>
   </w:style>
-  <w:style w:type="character" w:styleId="1012">
+  <w:style w:type="character" w:styleId="1022">
     <w:name w:val="Emphasis"/>
-    <w:basedOn w:val="1041"/>
+    <w:basedOn w:val="1051"/>
     <w:uiPriority w:val="20"/>
     <w:qFormat/>
     <w:pPr>
@@ -40385,9 +40393,9 @@
       <w:iCs/>
     </w:rPr>
   </w:style>
-  <w:style w:type="character" w:styleId="1013">
+  <w:style w:type="character" w:styleId="1023">
     <w:name w:val="Strong"/>
-    <w:basedOn w:val="1041"/>
+    <w:basedOn w:val="1051"/>
     <w:uiPriority w:val="22"/>
     <w:qFormat/>
     <w:pPr>
@@ -40400,9 +40408,9 @@
       <w:bCs/>
     </w:rPr>
   </w:style>
-  <w:style w:type="character" w:styleId="1014">
+  <w:style w:type="character" w:styleId="1024">
     <w:name w:val="Subtle Reference"/>
-    <w:basedOn w:val="1041"/>
+    <w:basedOn w:val="1051"/>
     <w:uiPriority w:val="31"/>
     <w:qFormat/>
     <w:pPr>
@@ -40415,9 +40423,9 @@
       <w:color w:val="5a5a5a" w:themeColor="text1" w:themeTint="A5"/>
     </w:rPr>
   </w:style>
-  <w:style w:type="character" w:styleId="1015">
+  <w:style w:type="character" w:styleId="1025">
     <w:name w:val="Book Title"/>
-    <w:basedOn w:val="1041"/>
+    <w:basedOn w:val="1051"/>
     <w:uiPriority w:val="33"/>
     <w:qFormat/>
     <w:pPr>
@@ -40433,10 +40441,10 @@
       <w:spacing w:val="5"/>
     </w:rPr>
   </w:style>
-  <w:style w:type="paragraph" w:styleId="1016">
+  <w:style w:type="paragraph" w:styleId="1026">
     <w:name w:val="Header"/>
-    <w:basedOn w:val="1044"/>
-    <w:link w:val="1017"/>
+    <w:basedOn w:val="1054"/>
+    <w:link w:val="1027"/>
     <w:uiPriority w:val="99"/>
     <w:unhideWhenUsed/>
     <w:pPr>
@@ -40449,10 +40457,10 @@
       <w:ind/>
     </w:pPr>
   </w:style>
-  <w:style w:type="character" w:styleId="1017">
+  <w:style w:type="character" w:styleId="1027">
     <w:name w:val="Header Char"/>
-    <w:basedOn w:val="1041"/>
-    <w:link w:val="1016"/>
+    <w:basedOn w:val="1051"/>
+    <w:link w:val="1026"/>
     <w:uiPriority w:val="99"/>
     <w:pPr>
       <w:pBdr/>
@@ -40460,10 +40468,10 @@
       <w:ind/>
     </w:pPr>
   </w:style>
-  <w:style w:type="paragraph" w:styleId="1018">
+  <w:style w:type="paragraph" w:styleId="1028">
     <w:name w:val="Footer"/>
-    <w:basedOn w:val="1044"/>
-    <w:link w:val="1019"/>
+    <w:basedOn w:val="1054"/>
+    <w:link w:val="1029"/>
     <w:uiPriority w:val="99"/>
     <w:unhideWhenUsed/>
     <w:pPr>
@@ -40476,10 +40484,10 @@
       <w:ind/>
     </w:pPr>
   </w:style>
-  <w:style w:type="character" w:styleId="1019">
+  <w:style w:type="character" w:styleId="1029">
     <w:name w:val="Footer Char"/>
-    <w:basedOn w:val="1041"/>
-    <w:link w:val="1018"/>
+    <w:basedOn w:val="1051"/>
+    <w:link w:val="1028"/>
     <w:uiPriority w:val="99"/>
     <w:pPr>
       <w:pBdr/>
@@ -40487,10 +40495,10 @@
       <w:ind/>
     </w:pPr>
   </w:style>
-  <w:style w:type="paragraph" w:styleId="1020">
+  <w:style w:type="paragraph" w:styleId="1030">
     <w:name w:val="Caption"/>
-    <w:basedOn w:val="1044"/>
-    <w:next w:val="1044"/>
+    <w:basedOn w:val="1054"/>
+    <w:next w:val="1054"/>
     <w:uiPriority w:val="35"/>
     <w:unhideWhenUsed/>
     <w:qFormat/>
@@ -40507,10 +40515,10 @@
       <w:szCs w:val="18"/>
     </w:rPr>
   </w:style>
-  <w:style w:type="paragraph" w:styleId="1021">
+  <w:style w:type="paragraph" w:styleId="1031">
     <w:name w:val="footnote text"/>
-    <w:basedOn w:val="1044"/>
-    <w:link w:val="1022"/>
+    <w:basedOn w:val="1054"/>
+    <w:link w:val="1032"/>
     <w:uiPriority w:val="99"/>
     <w:semiHidden/>
     <w:unhideWhenUsed/>
@@ -40524,10 +40532,10 @@
       <w:szCs w:val="20"/>
     </w:rPr>
   </w:style>
-  <w:style w:type="character" w:styleId="1022">
+  <w:style w:type="character" w:styleId="1032">
     <w:name w:val="Footnote Text Char"/>
-    <w:basedOn w:val="1041"/>
-    <w:link w:val="1021"/>
+    <w:basedOn w:val="1051"/>
+    <w:link w:val="1031"/>
     <w:uiPriority w:val="99"/>
     <w:semiHidden/>
     <w:pPr>
@@ -40540,9 +40548,9 @@
       <w:szCs w:val="20"/>
     </w:rPr>
   </w:style>
-  <w:style w:type="character" w:styleId="1023">
+  <w:style w:type="character" w:styleId="1033">
     <w:name w:val="footnote reference"/>
-    <w:basedOn w:val="1041"/>
+    <w:basedOn w:val="1051"/>
     <w:uiPriority w:val="99"/>
     <w:semiHidden/>
     <w:unhideWhenUsed/>
@@ -40555,10 +40563,10 @@
       <w:vertAlign w:val="superscript"/>
     </w:rPr>
   </w:style>
-  <w:style w:type="paragraph" w:styleId="1024">
+  <w:style w:type="paragraph" w:styleId="1034">
     <w:name w:val="endnote text"/>
-    <w:basedOn w:val="1044"/>
-    <w:link w:val="1025"/>
+    <w:basedOn w:val="1054"/>
+    <w:link w:val="1035"/>
     <w:uiPriority w:val="99"/>
     <w:semiHidden/>
     <w:unhideWhenUsed/>
@@ -40572,10 +40580,10 @@
       <w:szCs w:val="20"/>
     </w:rPr>
   </w:style>
-  <w:style w:type="character" w:styleId="1025">
+  <w:style w:type="character" w:styleId="1035">
     <w:name w:val="Endnote Text Char"/>
-    <w:basedOn w:val="1041"/>
-    <w:link w:val="1024"/>
+    <w:basedOn w:val="1051"/>
+    <w:link w:val="1034"/>
     <w:uiPriority w:val="99"/>
     <w:semiHidden/>
     <w:pPr>
@@ -40588,9 +40596,9 @@
       <w:szCs w:val="20"/>
     </w:rPr>
   </w:style>
-  <w:style w:type="character" w:styleId="1026">
+  <w:style w:type="character" w:styleId="1036">
     <w:name w:val="endnote reference"/>
-    <w:basedOn w:val="1041"/>
+    <w:basedOn w:val="1051"/>
     <w:uiPriority w:val="99"/>
     <w:semiHidden/>
     <w:unhideWhenUsed/>
@@ -40603,9 +40611,9 @@
       <w:vertAlign w:val="superscript"/>
     </w:rPr>
   </w:style>
-  <w:style w:type="character" w:styleId="1027">
+  <w:style w:type="character" w:styleId="1037">
     <w:name w:val="Hyperlink"/>
-    <w:basedOn w:val="1041"/>
+    <w:basedOn w:val="1051"/>
     <w:uiPriority w:val="99"/>
     <w:unhideWhenUsed/>
     <w:pPr>
@@ -40618,9 +40626,9 @@
       <w:u w:val="single"/>
     </w:rPr>
   </w:style>
-  <w:style w:type="character" w:styleId="1028">
+  <w:style w:type="character" w:styleId="1038">
     <w:name w:val="FollowedHyperlink"/>
-    <w:basedOn w:val="1041"/>
+    <w:basedOn w:val="1051"/>
     <w:uiPriority w:val="99"/>
     <w:semiHidden/>
     <w:unhideWhenUsed/>
@@ -40634,10 +40642,10 @@
       <w:u w:val="single"/>
     </w:rPr>
   </w:style>
-  <w:style w:type="paragraph" w:styleId="1029">
+  <w:style w:type="paragraph" w:styleId="1039">
     <w:name w:val="toc 1"/>
-    <w:basedOn w:val="1044"/>
-    <w:next w:val="1044"/>
+    <w:basedOn w:val="1054"/>
+    <w:next w:val="1054"/>
     <w:uiPriority w:val="39"/>
     <w:unhideWhenUsed/>
     <w:pPr>
@@ -40646,10 +40654,10 @@
       <w:ind/>
     </w:pPr>
   </w:style>
-  <w:style w:type="paragraph" w:styleId="1030">
+  <w:style w:type="paragraph" w:styleId="1040">
     <w:name w:val="toc 2"/>
-    <w:basedOn w:val="1044"/>
-    <w:next w:val="1044"/>
+    <w:basedOn w:val="1054"/>
+    <w:next w:val="1054"/>
     <w:uiPriority w:val="39"/>
     <w:unhideWhenUsed/>
     <w:pPr>
@@ -40658,10 +40666,10 @@
       <w:ind w:left="220"/>
     </w:pPr>
   </w:style>
-  <w:style w:type="paragraph" w:styleId="1031">
+  <w:style w:type="paragraph" w:styleId="1041">
     <w:name w:val="toc 3"/>
-    <w:basedOn w:val="1044"/>
-    <w:next w:val="1044"/>
+    <w:basedOn w:val="1054"/>
+    <w:next w:val="1054"/>
     <w:uiPriority w:val="39"/>
     <w:unhideWhenUsed/>
     <w:pPr>
@@ -40670,10 +40678,10 @@
       <w:ind w:left="440"/>
     </w:pPr>
   </w:style>
-  <w:style w:type="paragraph" w:styleId="1032">
+  <w:style w:type="paragraph" w:styleId="1042">
     <w:name w:val="toc 4"/>
-    <w:basedOn w:val="1044"/>
-    <w:next w:val="1044"/>
+    <w:basedOn w:val="1054"/>
+    <w:next w:val="1054"/>
     <w:uiPriority w:val="39"/>
     <w:unhideWhenUsed/>
     <w:pPr>
@@ -40682,10 +40690,10 @@
       <w:ind w:left="660"/>
     </w:pPr>
   </w:style>
-  <w:style w:type="paragraph" w:styleId="1033">
+  <w:style w:type="paragraph" w:styleId="1043">
     <w:name w:val="toc 5"/>
-    <w:basedOn w:val="1044"/>
-    <w:next w:val="1044"/>
+    <w:basedOn w:val="1054"/>
+    <w:next w:val="1054"/>
     <w:uiPriority w:val="39"/>
     <w:unhideWhenUsed/>
     <w:pPr>
@@ -40694,10 +40702,10 @@
       <w:ind w:left="880"/>
     </w:pPr>
   </w:style>
-  <w:style w:type="paragraph" w:styleId="1034">
+  <w:style w:type="paragraph" w:styleId="1044">
     <w:name w:val="toc 6"/>
-    <w:basedOn w:val="1044"/>
-    <w:next w:val="1044"/>
+    <w:basedOn w:val="1054"/>
+    <w:next w:val="1054"/>
     <w:uiPriority w:val="39"/>
     <w:unhideWhenUsed/>
     <w:pPr>
@@ -40706,10 +40714,10 @@
       <w:ind w:left="1100"/>
     </w:pPr>
   </w:style>
-  <w:style w:type="paragraph" w:styleId="1035">
+  <w:style w:type="paragraph" w:styleId="1045">
     <w:name w:val="toc 7"/>
-    <w:basedOn w:val="1044"/>
-    <w:next w:val="1044"/>
+    <w:basedOn w:val="1054"/>
+    <w:next w:val="1054"/>
     <w:uiPriority w:val="39"/>
     <w:unhideWhenUsed/>
     <w:pPr>
@@ -40718,10 +40726,10 @@
       <w:ind w:left="1320"/>
     </w:pPr>
   </w:style>
-  <w:style w:type="paragraph" w:styleId="1036">
+  <w:style w:type="paragraph" w:styleId="1046">
     <w:name w:val="toc 8"/>
-    <w:basedOn w:val="1044"/>
-    <w:next w:val="1044"/>
+    <w:basedOn w:val="1054"/>
+    <w:next w:val="1054"/>
     <w:uiPriority w:val="39"/>
     <w:unhideWhenUsed/>
     <w:pPr>
@@ -40730,10 +40738,10 @@
       <w:ind w:left="1540"/>
     </w:pPr>
   </w:style>
-  <w:style w:type="paragraph" w:styleId="1037">
+  <w:style w:type="paragraph" w:styleId="1047">
     <w:name w:val="toc 9"/>
-    <w:basedOn w:val="1044"/>
-    <w:next w:val="1044"/>
+    <w:basedOn w:val="1054"/>
+    <w:next w:val="1054"/>
     <w:uiPriority w:val="39"/>
     <w:unhideWhenUsed/>
     <w:pPr>
@@ -40742,9 +40750,9 @@
       <w:ind w:left="1760"/>
     </w:pPr>
   </w:style>
-  <w:style w:type="character" w:styleId="1038">
+  <w:style w:type="character" w:styleId="1048">
     <w:name w:val="Placeholder Text"/>
-    <w:basedOn w:val="1041"/>
+    <w:basedOn w:val="1051"/>
     <w:uiPriority w:val="99"/>
     <w:semiHidden/>
     <w:pPr>
@@ -40756,7 +40764,7 @@
       <w:color w:val="666666"/>
     </w:rPr>
   </w:style>
-  <w:style w:type="paragraph" w:styleId="1039">
+  <w:style w:type="paragraph" w:styleId="1049">
     <w:name w:val="TOC Heading"/>
     <w:uiPriority w:val="39"/>
     <w:unhideWhenUsed/>
@@ -40766,10 +40774,10 @@
       <w:ind/>
     </w:pPr>
   </w:style>
-  <w:style w:type="paragraph" w:styleId="1040">
+  <w:style w:type="paragraph" w:styleId="1050">
     <w:name w:val="table of figures"/>
-    <w:basedOn w:val="1044"/>
-    <w:next w:val="1044"/>
+    <w:basedOn w:val="1054"/>
+    <w:next w:val="1054"/>
     <w:uiPriority w:val="99"/>
     <w:unhideWhenUsed/>
     <w:pPr>
@@ -40778,7 +40786,7 @@
       <w:ind/>
     </w:pPr>
   </w:style>
-  <w:style w:type="character" w:styleId="1041" w:default="1">
+  <w:style w:type="character" w:styleId="1051" w:default="1">
     <w:name w:val="Default Paragraph Font"/>
     <w:uiPriority w:val="1"/>
     <w:semiHidden/>
@@ -40789,7 +40797,7 @@
       <w:ind/>
     </w:pPr>
   </w:style>
-  <w:style w:type="table" w:styleId="1042">
+  <w:style w:type="table" w:styleId="1052">
     <w:name w:val="Table Normal"/>
     <w:uiPriority w:val="2"/>
     <w:semiHidden/>
@@ -40983,7 +40991,7 @@
       </w:tcPr>
     </w:tblStylePr>
   </w:style>
-  <w:style w:type="numbering" w:styleId="1043" w:default="1">
+  <w:style w:type="numbering" w:styleId="1053" w:default="1">
     <w:name w:val="No List"/>
     <w:uiPriority w:val="99"/>
     <w:semiHidden/>
@@ -40994,7 +41002,7 @@
       <w:ind/>
     </w:pPr>
   </w:style>
-  <w:style w:type="paragraph" w:styleId="1044" w:default="1">
+  <w:style w:type="paragraph" w:styleId="1054" w:default="1">
     <w:name w:val="Normal"/>
     <w:uiPriority w:val="1"/>
     <w:qFormat/>
@@ -41008,9 +41016,9 @@
       <w:lang w:val="en-US" w:eastAsia="en-US" w:bidi="ar-SA"/>
     </w:rPr>
   </w:style>
-  <w:style w:type="paragraph" w:styleId="1045">
+  <w:style w:type="paragraph" w:styleId="1055">
     <w:name w:val="Body Text"/>
-    <w:basedOn w:val="1044"/>
+    <w:basedOn w:val="1054"/>
     <w:uiPriority w:val="1"/>
     <w:qFormat/>
     <w:pPr>
@@ -41025,9 +41033,9 @@
       <w:lang w:val="en-US" w:eastAsia="en-US" w:bidi="ar-SA"/>
     </w:rPr>
   </w:style>
-  <w:style w:type="paragraph" w:styleId="1046">
+  <w:style w:type="paragraph" w:styleId="1056">
     <w:name w:val="Heading 1"/>
-    <w:basedOn w:val="1044"/>
+    <w:basedOn w:val="1054"/>
     <w:uiPriority w:val="1"/>
     <w:qFormat/>
     <w:pPr>
@@ -41046,9 +41054,9 @@
       <w:lang w:val="en-US" w:eastAsia="en-US" w:bidi="ar-SA"/>
     </w:rPr>
   </w:style>
-  <w:style w:type="paragraph" w:styleId="1047">
+  <w:style w:type="paragraph" w:styleId="1057">
     <w:name w:val="Heading 2"/>
-    <w:basedOn w:val="1044"/>
+    <w:basedOn w:val="1054"/>
     <w:uiPriority w:val="1"/>
     <w:qFormat/>
     <w:pPr>
@@ -41066,9 +41074,9 @@
       <w:lang w:val="en-US" w:eastAsia="en-US" w:bidi="ar-SA"/>
     </w:rPr>
   </w:style>
-  <w:style w:type="paragraph" w:styleId="1048">
+  <w:style w:type="paragraph" w:styleId="1058">
     <w:name w:val="List Paragraph"/>
-    <w:basedOn w:val="1044"/>
+    <w:basedOn w:val="1054"/>
     <w:uiPriority w:val="1"/>
     <w:qFormat/>
     <w:pPr>
@@ -41082,9 +41090,9 @@
       <w:lang w:val="en-US" w:eastAsia="en-US" w:bidi="ar-SA"/>
     </w:rPr>
   </w:style>
-  <w:style w:type="paragraph" w:styleId="1049">
+  <w:style w:type="paragraph" w:styleId="1059">
     <w:name w:val="Table Paragraph"/>
-    <w:basedOn w:val="1044"/>
+    <w:basedOn w:val="1054"/>
     <w:uiPriority w:val="1"/>
     <w:qFormat/>
     <w:pPr>

</xml_diff>